<commit_message>
Revert "Merge branch 'main' of https://github.com/galaxyzed11-ai/nhom3-11-11"
This reverts commit f09bfc844697aba95dc79ebe98d5ea5353671634, reversing
changes made to f7fd2525e6396a1bc7dae3b6cd4bfe42f0eea591.
</commit_message>
<xml_diff>
--- a/BT Git 2.docx
+++ b/BT Git 2.docx
@@ -28,196 +28,14 @@
           <w:szCs w:val="28"/>
         </w:rPr>
       </w:pPr>
-      <w:proofErr w:type="spellStart"/>
       <w:r>
         <w:rPr>
           <w:rFonts w:ascii="Times New Roman" w:hAnsi="Times New Roman" w:cs="Times New Roman"/>
           <w:sz w:val="28"/>
           <w:szCs w:val="28"/>
         </w:rPr>
-        <w:t>Giải</w:t>
+        <w:t>Giải thích và cho ví dụ minh họa các câu sau</w:t>
       </w:r>
-      <w:proofErr w:type="spellEnd"/>
-      <w:r>
-        <w:rPr>
-          <w:rFonts w:ascii="Times New Roman" w:hAnsi="Times New Roman" w:cs="Times New Roman"/>
-          <w:sz w:val="28"/>
-          <w:szCs w:val="28"/>
-        </w:rPr>
-        <w:t xml:space="preserve"> </w:t>
-      </w:r>
-      <w:proofErr w:type="spellStart"/>
-      <w:r>
-        <w:rPr>
-          <w:rFonts w:ascii="Times New Roman" w:hAnsi="Times New Roman" w:cs="Times New Roman"/>
-          <w:sz w:val="28"/>
-          <w:szCs w:val="28"/>
-        </w:rPr>
-        <w:t>thích</w:t>
-      </w:r>
-      <w:proofErr w:type="spellEnd"/>
-      <w:r>
-        <w:rPr>
-          <w:rFonts w:ascii="Times New Roman" w:hAnsi="Times New Roman" w:cs="Times New Roman"/>
-          <w:sz w:val="28"/>
-          <w:szCs w:val="28"/>
-        </w:rPr>
-        <w:t xml:space="preserve"> </w:t>
-      </w:r>
-      <w:proofErr w:type="spellStart"/>
-      <w:r>
-        <w:rPr>
-          <w:rFonts w:ascii="Times New Roman" w:hAnsi="Times New Roman" w:cs="Times New Roman"/>
-          <w:sz w:val="28"/>
-          <w:szCs w:val="28"/>
-        </w:rPr>
-        <w:t>và</w:t>
-      </w:r>
-      <w:proofErr w:type="spellEnd"/>
-      <w:r>
-        <w:rPr>
-          <w:rFonts w:ascii="Times New Roman" w:hAnsi="Times New Roman" w:cs="Times New Roman"/>
-          <w:sz w:val="28"/>
-          <w:szCs w:val="28"/>
-        </w:rPr>
-        <w:t xml:space="preserve"> </w:t>
-      </w:r>
-      <w:proofErr w:type="spellStart"/>
-      <w:r>
-        <w:rPr>
-          <w:rFonts w:ascii="Times New Roman" w:hAnsi="Times New Roman" w:cs="Times New Roman"/>
-          <w:sz w:val="28"/>
-          <w:szCs w:val="28"/>
-        </w:rPr>
-        <w:t>cho</w:t>
-      </w:r>
-      <w:proofErr w:type="spellEnd"/>
-      <w:r>
-        <w:rPr>
-          <w:rFonts w:ascii="Times New Roman" w:hAnsi="Times New Roman" w:cs="Times New Roman"/>
-          <w:sz w:val="28"/>
-          <w:szCs w:val="28"/>
-        </w:rPr>
-        <w:t xml:space="preserve"> </w:t>
-      </w:r>
-      <w:proofErr w:type="spellStart"/>
-      <w:r>
-        <w:rPr>
-          <w:rFonts w:ascii="Times New Roman" w:hAnsi="Times New Roman" w:cs="Times New Roman"/>
-          <w:sz w:val="28"/>
-          <w:szCs w:val="28"/>
-        </w:rPr>
-        <w:t>ví</w:t>
-      </w:r>
-      <w:proofErr w:type="spellEnd"/>
-      <w:r>
-        <w:rPr>
-          <w:rFonts w:ascii="Times New Roman" w:hAnsi="Times New Roman" w:cs="Times New Roman"/>
-          <w:sz w:val="28"/>
-          <w:szCs w:val="28"/>
-        </w:rPr>
-        <w:t xml:space="preserve"> </w:t>
-      </w:r>
-      <w:proofErr w:type="spellStart"/>
-      <w:r>
-        <w:rPr>
-          <w:rFonts w:ascii="Times New Roman" w:hAnsi="Times New Roman" w:cs="Times New Roman"/>
-          <w:sz w:val="28"/>
-          <w:szCs w:val="28"/>
-        </w:rPr>
-        <w:t>dụ</w:t>
-      </w:r>
-      <w:proofErr w:type="spellEnd"/>
-      <w:r>
-        <w:rPr>
-          <w:rFonts w:ascii="Times New Roman" w:hAnsi="Times New Roman" w:cs="Times New Roman"/>
-          <w:sz w:val="28"/>
-          <w:szCs w:val="28"/>
-        </w:rPr>
-        <w:t xml:space="preserve"> </w:t>
-      </w:r>
-      <w:proofErr w:type="spellStart"/>
-      <w:r>
-        <w:rPr>
-          <w:rFonts w:ascii="Times New Roman" w:hAnsi="Times New Roman" w:cs="Times New Roman"/>
-          <w:sz w:val="28"/>
-          <w:szCs w:val="28"/>
-        </w:rPr>
-        <w:t>minh</w:t>
-      </w:r>
-      <w:proofErr w:type="spellEnd"/>
-      <w:r>
-        <w:rPr>
-          <w:rFonts w:ascii="Times New Roman" w:hAnsi="Times New Roman" w:cs="Times New Roman"/>
-          <w:sz w:val="28"/>
-          <w:szCs w:val="28"/>
-        </w:rPr>
-        <w:t xml:space="preserve"> </w:t>
-      </w:r>
-      <w:proofErr w:type="spellStart"/>
-      <w:r>
-        <w:rPr>
-          <w:rFonts w:ascii="Times New Roman" w:hAnsi="Times New Roman" w:cs="Times New Roman"/>
-          <w:sz w:val="28"/>
-          <w:szCs w:val="28"/>
-        </w:rPr>
-        <w:t>họa</w:t>
-      </w:r>
-      <w:proofErr w:type="spellEnd"/>
-      <w:r>
-        <w:rPr>
-          <w:rFonts w:ascii="Times New Roman" w:hAnsi="Times New Roman" w:cs="Times New Roman"/>
-          <w:sz w:val="28"/>
-          <w:szCs w:val="28"/>
-        </w:rPr>
-        <w:t xml:space="preserve"> </w:t>
-      </w:r>
-      <w:proofErr w:type="spellStart"/>
-      <w:r>
-        <w:rPr>
-          <w:rFonts w:ascii="Times New Roman" w:hAnsi="Times New Roman" w:cs="Times New Roman"/>
-          <w:sz w:val="28"/>
-          <w:szCs w:val="28"/>
-        </w:rPr>
-        <w:t>các</w:t>
-      </w:r>
-      <w:proofErr w:type="spellEnd"/>
-      <w:r>
-        <w:rPr>
-          <w:rFonts w:ascii="Times New Roman" w:hAnsi="Times New Roman" w:cs="Times New Roman"/>
-          <w:sz w:val="28"/>
-          <w:szCs w:val="28"/>
-        </w:rPr>
-        <w:t xml:space="preserve"> </w:t>
-      </w:r>
-      <w:proofErr w:type="spellStart"/>
-      <w:r>
-        <w:rPr>
-          <w:rFonts w:ascii="Times New Roman" w:hAnsi="Times New Roman" w:cs="Times New Roman"/>
-          <w:sz w:val="28"/>
-          <w:szCs w:val="28"/>
-        </w:rPr>
-        <w:t>câu</w:t>
-      </w:r>
-      <w:proofErr w:type="spellEnd"/>
-      <w:r>
-        <w:rPr>
-          <w:rFonts w:ascii="Times New Roman" w:hAnsi="Times New Roman" w:cs="Times New Roman"/>
-          <w:sz w:val="28"/>
-          <w:szCs w:val="28"/>
-        </w:rPr>
-        <w:t xml:space="preserve"> </w:t>
-      </w:r>
-      <w:proofErr w:type="spellStart"/>
-      <w:r>
-        <w:rPr>
-          <w:rFonts w:ascii="Times New Roman" w:hAnsi="Times New Roman" w:cs="Times New Roman"/>
-          <w:sz w:val="28"/>
-          <w:szCs w:val="28"/>
-        </w:rPr>
-        <w:t>sau</w:t>
-      </w:r>
-      <w:proofErr w:type="spellEnd"/>
     </w:p>
     <w:p>
       <w:pPr>
@@ -232,106 +50,14 @@
           <w:szCs w:val="28"/>
         </w:rPr>
       </w:pPr>
-      <w:proofErr w:type="spellStart"/>
       <w:r>
         <w:rPr>
           <w:rFonts w:ascii="Times New Roman" w:hAnsi="Times New Roman" w:cs="Times New Roman"/>
           <w:sz w:val="28"/>
           <w:szCs w:val="28"/>
         </w:rPr>
-        <w:t>Phân</w:t>
+        <w:t>Phân biệt các cấp độ reset</w:t>
       </w:r>
-      <w:proofErr w:type="spellEnd"/>
-      <w:r>
-        <w:rPr>
-          <w:rFonts w:ascii="Times New Roman" w:hAnsi="Times New Roman" w:cs="Times New Roman"/>
-          <w:sz w:val="28"/>
-          <w:szCs w:val="28"/>
-        </w:rPr>
-        <w:t xml:space="preserve"> </w:t>
-      </w:r>
-      <w:proofErr w:type="spellStart"/>
-      <w:r>
-        <w:rPr>
-          <w:rFonts w:ascii="Times New Roman" w:hAnsi="Times New Roman" w:cs="Times New Roman"/>
-          <w:sz w:val="28"/>
-          <w:szCs w:val="28"/>
-        </w:rPr>
-        <w:t>biệt</w:t>
-      </w:r>
-      <w:proofErr w:type="spellEnd"/>
-      <w:r>
-        <w:rPr>
-          <w:rFonts w:ascii="Times New Roman" w:hAnsi="Times New Roman" w:cs="Times New Roman"/>
-          <w:sz w:val="28"/>
-          <w:szCs w:val="28"/>
-        </w:rPr>
-        <w:t xml:space="preserve"> </w:t>
-      </w:r>
-      <w:proofErr w:type="spellStart"/>
-      <w:r>
-        <w:rPr>
-          <w:rFonts w:ascii="Times New Roman" w:hAnsi="Times New Roman" w:cs="Times New Roman"/>
-          <w:sz w:val="28"/>
-          <w:szCs w:val="28"/>
-        </w:rPr>
-        <w:t>các</w:t>
-      </w:r>
-      <w:proofErr w:type="spellEnd"/>
-      <w:r>
-        <w:rPr>
-          <w:rFonts w:ascii="Times New Roman" w:hAnsi="Times New Roman" w:cs="Times New Roman"/>
-          <w:sz w:val="28"/>
-          <w:szCs w:val="28"/>
-        </w:rPr>
-        <w:t xml:space="preserve"> </w:t>
-      </w:r>
-      <w:proofErr w:type="spellStart"/>
-      <w:r>
-        <w:rPr>
-          <w:rFonts w:ascii="Times New Roman" w:hAnsi="Times New Roman" w:cs="Times New Roman"/>
-          <w:sz w:val="28"/>
-          <w:szCs w:val="28"/>
-        </w:rPr>
-        <w:t>cấp</w:t>
-      </w:r>
-      <w:proofErr w:type="spellEnd"/>
-      <w:r>
-        <w:rPr>
-          <w:rFonts w:ascii="Times New Roman" w:hAnsi="Times New Roman" w:cs="Times New Roman"/>
-          <w:sz w:val="28"/>
-          <w:szCs w:val="28"/>
-        </w:rPr>
-        <w:t xml:space="preserve"> </w:t>
-      </w:r>
-      <w:proofErr w:type="spellStart"/>
-      <w:r>
-        <w:rPr>
-          <w:rFonts w:ascii="Times New Roman" w:hAnsi="Times New Roman" w:cs="Times New Roman"/>
-          <w:sz w:val="28"/>
-          <w:szCs w:val="28"/>
-        </w:rPr>
-        <w:t>độ</w:t>
-      </w:r>
-      <w:proofErr w:type="spellEnd"/>
-      <w:r>
-        <w:rPr>
-          <w:rFonts w:ascii="Times New Roman" w:hAnsi="Times New Roman" w:cs="Times New Roman"/>
-          <w:sz w:val="28"/>
-          <w:szCs w:val="28"/>
-        </w:rPr>
-        <w:t xml:space="preserve"> </w:t>
-      </w:r>
-      <w:proofErr w:type="gramStart"/>
-      <w:r>
-        <w:rPr>
-          <w:rFonts w:ascii="Times New Roman" w:hAnsi="Times New Roman" w:cs="Times New Roman"/>
-          <w:sz w:val="28"/>
-          <w:szCs w:val="28"/>
-        </w:rPr>
-        <w:t>reset</w:t>
-      </w:r>
-      <w:proofErr w:type="gramEnd"/>
     </w:p>
     <w:p>
       <w:pPr>
@@ -346,34 +72,14 @@
           <w:szCs w:val="28"/>
         </w:rPr>
       </w:pPr>
-      <w:proofErr w:type="spellStart"/>
       <w:r>
         <w:rPr>
           <w:rFonts w:ascii="Times New Roman" w:hAnsi="Times New Roman" w:cs="Times New Roman"/>
           <w:sz w:val="28"/>
           <w:szCs w:val="28"/>
         </w:rPr>
-        <w:t>Phân</w:t>
+        <w:t>Phân biệt</w:t>
       </w:r>
-      <w:proofErr w:type="spellEnd"/>
-      <w:r>
-        <w:rPr>
-          <w:rFonts w:ascii="Times New Roman" w:hAnsi="Times New Roman" w:cs="Times New Roman"/>
-          <w:sz w:val="28"/>
-          <w:szCs w:val="28"/>
-        </w:rPr>
-        <w:t xml:space="preserve"> </w:t>
-      </w:r>
-      <w:proofErr w:type="spellStart"/>
-      <w:r>
-        <w:rPr>
-          <w:rFonts w:ascii="Times New Roman" w:hAnsi="Times New Roman" w:cs="Times New Roman"/>
-          <w:sz w:val="28"/>
-          <w:szCs w:val="28"/>
-        </w:rPr>
-        <w:t>biệt</w:t>
-      </w:r>
-      <w:proofErr w:type="spellEnd"/>
       <w:r>
         <w:rPr>
           <w:rFonts w:ascii="Times New Roman" w:hAnsi="Times New Roman" w:cs="Times New Roman"/>
@@ -390,36 +96,8 @@
           <w:sz w:val="28"/>
           <w:szCs w:val="28"/>
         </w:rPr>
-        <w:t xml:space="preserve">Merge </w:t>
+        <w:t>Merge và rebase</w:t>
       </w:r>
-      <w:proofErr w:type="spellStart"/>
-      <w:r>
-        <w:rPr>
-          <w:rFonts w:ascii="Times New Roman" w:hAnsi="Times New Roman" w:cs="Times New Roman"/>
-          <w:sz w:val="28"/>
-          <w:szCs w:val="28"/>
-        </w:rPr>
-        <w:t>và</w:t>
-      </w:r>
-      <w:proofErr w:type="spellEnd"/>
-      <w:r>
-        <w:rPr>
-          <w:rFonts w:ascii="Times New Roman" w:hAnsi="Times New Roman" w:cs="Times New Roman"/>
-          <w:sz w:val="28"/>
-          <w:szCs w:val="28"/>
-        </w:rPr>
-        <w:t xml:space="preserve"> </w:t>
-      </w:r>
-      <w:proofErr w:type="gramStart"/>
-      <w:r>
-        <w:rPr>
-          <w:rFonts w:ascii="Times New Roman" w:hAnsi="Times New Roman" w:cs="Times New Roman"/>
-          <w:sz w:val="28"/>
-          <w:szCs w:val="28"/>
-        </w:rPr>
-        <w:t>rebase</w:t>
-      </w:r>
-      <w:proofErr w:type="gramEnd"/>
     </w:p>
     <w:p>
       <w:pPr>
@@ -434,70 +112,14 @@
           <w:szCs w:val="28"/>
         </w:rPr>
       </w:pPr>
-      <w:proofErr w:type="spellStart"/>
       <w:r>
         <w:rPr>
           <w:rFonts w:ascii="Times New Roman" w:hAnsi="Times New Roman" w:cs="Times New Roman"/>
           <w:sz w:val="28"/>
           <w:szCs w:val="28"/>
         </w:rPr>
-        <w:t>Phân</w:t>
+        <w:t>Phân biệt pull và fetch</w:t>
       </w:r>
-      <w:proofErr w:type="spellEnd"/>
-      <w:r>
-        <w:rPr>
-          <w:rFonts w:ascii="Times New Roman" w:hAnsi="Times New Roman" w:cs="Times New Roman"/>
-          <w:sz w:val="28"/>
-          <w:szCs w:val="28"/>
-        </w:rPr>
-        <w:t xml:space="preserve"> </w:t>
-      </w:r>
-      <w:proofErr w:type="spellStart"/>
-      <w:r>
-        <w:rPr>
-          <w:rFonts w:ascii="Times New Roman" w:hAnsi="Times New Roman" w:cs="Times New Roman"/>
-          <w:sz w:val="28"/>
-          <w:szCs w:val="28"/>
-        </w:rPr>
-        <w:t>biệt</w:t>
-      </w:r>
-      <w:proofErr w:type="spellEnd"/>
-      <w:r>
-        <w:rPr>
-          <w:rFonts w:ascii="Times New Roman" w:hAnsi="Times New Roman" w:cs="Times New Roman"/>
-          <w:sz w:val="28"/>
-          <w:szCs w:val="28"/>
-        </w:rPr>
-        <w:t xml:space="preserve"> pull </w:t>
-      </w:r>
-      <w:proofErr w:type="spellStart"/>
-      <w:r>
-        <w:rPr>
-          <w:rFonts w:ascii="Times New Roman" w:hAnsi="Times New Roman" w:cs="Times New Roman"/>
-          <w:sz w:val="28"/>
-          <w:szCs w:val="28"/>
-        </w:rPr>
-        <w:t>và</w:t>
-      </w:r>
-      <w:proofErr w:type="spellEnd"/>
-      <w:r>
-        <w:rPr>
-          <w:rFonts w:ascii="Times New Roman" w:hAnsi="Times New Roman" w:cs="Times New Roman"/>
-          <w:sz w:val="28"/>
-          <w:szCs w:val="28"/>
-        </w:rPr>
-        <w:t xml:space="preserve"> </w:t>
-      </w:r>
-      <w:proofErr w:type="gramStart"/>
-      <w:r>
-        <w:rPr>
-          <w:rFonts w:ascii="Times New Roman" w:hAnsi="Times New Roman" w:cs="Times New Roman"/>
-          <w:sz w:val="28"/>
-          <w:szCs w:val="28"/>
-        </w:rPr>
-        <w:t>fetch</w:t>
-      </w:r>
-      <w:proofErr w:type="gramEnd"/>
     </w:p>
     <w:p>
       <w:pPr>
@@ -518,16 +140,7 @@
           <w:sz w:val="28"/>
           <w:szCs w:val="28"/>
         </w:rPr>
-        <w:t xml:space="preserve">Cherry pick </w:t>
-      </w:r>
-      <w:proofErr w:type="spellStart"/>
-      <w:r>
-        <w:rPr>
-          <w:rFonts w:ascii="Times New Roman" w:hAnsi="Times New Roman" w:cs="Times New Roman"/>
-          <w:sz w:val="28"/>
-          <w:szCs w:val="28"/>
-        </w:rPr>
-        <w:t>d</w:t>
+        <w:t>Cherry pick d</w:t>
       </w:r>
       <w:r>
         <w:rPr>
@@ -543,70 +156,7 @@
           <w:sz w:val="28"/>
           <w:szCs w:val="28"/>
         </w:rPr>
-        <w:t>ng</w:t>
-      </w:r>
-      <w:proofErr w:type="spellEnd"/>
-      <w:r>
-        <w:rPr>
-          <w:rFonts w:ascii="Times New Roman" w:hAnsi="Times New Roman" w:cs="Times New Roman"/>
-          <w:sz w:val="28"/>
-          <w:szCs w:val="28"/>
-        </w:rPr>
-        <w:t xml:space="preserve"> </w:t>
-      </w:r>
-      <w:proofErr w:type="spellStart"/>
-      <w:r>
-        <w:rPr>
-          <w:rFonts w:ascii="Times New Roman" w:hAnsi="Times New Roman" w:cs="Times New Roman"/>
-          <w:sz w:val="28"/>
-          <w:szCs w:val="28"/>
-        </w:rPr>
-        <w:t>để</w:t>
-      </w:r>
-      <w:proofErr w:type="spellEnd"/>
-      <w:r>
-        <w:rPr>
-          <w:rFonts w:ascii="Times New Roman" w:hAnsi="Times New Roman" w:cs="Times New Roman"/>
-          <w:sz w:val="28"/>
-          <w:szCs w:val="28"/>
-        </w:rPr>
-        <w:t xml:space="preserve"> </w:t>
-      </w:r>
-      <w:proofErr w:type="spellStart"/>
-      <w:r>
-        <w:rPr>
-          <w:rFonts w:ascii="Times New Roman" w:hAnsi="Times New Roman" w:cs="Times New Roman"/>
-          <w:sz w:val="28"/>
-          <w:szCs w:val="28"/>
-        </w:rPr>
-        <w:t>làm</w:t>
-      </w:r>
-      <w:proofErr w:type="spellEnd"/>
-      <w:r>
-        <w:rPr>
-          <w:rFonts w:ascii="Times New Roman" w:hAnsi="Times New Roman" w:cs="Times New Roman"/>
-          <w:sz w:val="28"/>
-          <w:szCs w:val="28"/>
-        </w:rPr>
-        <w:t xml:space="preserve"> </w:t>
-      </w:r>
-      <w:proofErr w:type="spellStart"/>
-      <w:r>
-        <w:rPr>
-          <w:rFonts w:ascii="Times New Roman" w:hAnsi="Times New Roman" w:cs="Times New Roman"/>
-          <w:sz w:val="28"/>
-          <w:szCs w:val="28"/>
-        </w:rPr>
-        <w:t>gì</w:t>
-      </w:r>
-      <w:proofErr w:type="spellEnd"/>
-      <w:r>
-        <w:rPr>
-          <w:rFonts w:ascii="Times New Roman" w:hAnsi="Times New Roman" w:cs="Times New Roman"/>
-          <w:sz w:val="28"/>
-          <w:szCs w:val="28"/>
-        </w:rPr>
-        <w:t>?</w:t>
+        <w:t>ng để làm gì?</w:t>
       </w:r>
       <w:r>
         <w:rPr>
@@ -614,97 +164,7 @@
           <w:sz w:val="28"/>
           <w:szCs w:val="28"/>
         </w:rPr>
-        <w:t xml:space="preserve"> </w:t>
-      </w:r>
-      <w:proofErr w:type="spellStart"/>
-      <w:r>
-        <w:rPr>
-          <w:rFonts w:ascii="Times New Roman" w:hAnsi="Times New Roman" w:cs="Times New Roman"/>
-          <w:sz w:val="28"/>
-          <w:szCs w:val="28"/>
-        </w:rPr>
-        <w:t>Cách</w:t>
-      </w:r>
-      <w:proofErr w:type="spellEnd"/>
-      <w:r>
-        <w:rPr>
-          <w:rFonts w:ascii="Times New Roman" w:hAnsi="Times New Roman" w:cs="Times New Roman"/>
-          <w:sz w:val="28"/>
-          <w:szCs w:val="28"/>
-        </w:rPr>
-        <w:t xml:space="preserve"> </w:t>
-      </w:r>
-      <w:proofErr w:type="spellStart"/>
-      <w:r>
-        <w:rPr>
-          <w:rFonts w:ascii="Times New Roman" w:hAnsi="Times New Roman" w:cs="Times New Roman"/>
-          <w:sz w:val="28"/>
-          <w:szCs w:val="28"/>
-        </w:rPr>
-        <w:t>dùng</w:t>
-      </w:r>
-      <w:proofErr w:type="spellEnd"/>
-      <w:r>
-        <w:rPr>
-          <w:rFonts w:ascii="Times New Roman" w:hAnsi="Times New Roman" w:cs="Times New Roman"/>
-          <w:sz w:val="28"/>
-          <w:szCs w:val="28"/>
-        </w:rPr>
-        <w:t xml:space="preserve"> </w:t>
-      </w:r>
-      <w:proofErr w:type="spellStart"/>
-      <w:r>
-        <w:rPr>
-          <w:rFonts w:ascii="Times New Roman" w:hAnsi="Times New Roman" w:cs="Times New Roman"/>
-          <w:sz w:val="28"/>
-          <w:szCs w:val="28"/>
-        </w:rPr>
-        <w:t>như</w:t>
-      </w:r>
-      <w:proofErr w:type="spellEnd"/>
-      <w:r>
-        <w:rPr>
-          <w:rFonts w:ascii="Times New Roman" w:hAnsi="Times New Roman" w:cs="Times New Roman"/>
-          <w:sz w:val="28"/>
-          <w:szCs w:val="28"/>
-        </w:rPr>
-        <w:t xml:space="preserve"> </w:t>
-      </w:r>
-      <w:proofErr w:type="spellStart"/>
-      <w:r>
-        <w:rPr>
-          <w:rFonts w:ascii="Times New Roman" w:hAnsi="Times New Roman" w:cs="Times New Roman"/>
-          <w:sz w:val="28"/>
-          <w:szCs w:val="28"/>
-        </w:rPr>
-        <w:t>thế</w:t>
-      </w:r>
-      <w:proofErr w:type="spellEnd"/>
-      <w:r>
-        <w:rPr>
-          <w:rFonts w:ascii="Times New Roman" w:hAnsi="Times New Roman" w:cs="Times New Roman"/>
-          <w:sz w:val="28"/>
-          <w:szCs w:val="28"/>
-        </w:rPr>
-        <w:t xml:space="preserve"> </w:t>
-      </w:r>
-      <w:proofErr w:type="spellStart"/>
-      <w:r>
-        <w:rPr>
-          <w:rFonts w:ascii="Times New Roman" w:hAnsi="Times New Roman" w:cs="Times New Roman"/>
-          <w:sz w:val="28"/>
-          <w:szCs w:val="28"/>
-        </w:rPr>
-        <w:t>nào</w:t>
-      </w:r>
-      <w:proofErr w:type="spellEnd"/>
-      <w:r>
-        <w:rPr>
-          <w:rFonts w:ascii="Times New Roman" w:hAnsi="Times New Roman" w:cs="Times New Roman"/>
-          <w:sz w:val="28"/>
-          <w:szCs w:val="28"/>
-        </w:rPr>
-        <w:t>?</w:t>
+        <w:t xml:space="preserve"> Cách dùng như thế nào?</w:t>
       </w:r>
     </w:p>
     <w:p>
@@ -720,77 +180,13 @@
           <w:szCs w:val="28"/>
         </w:rPr>
       </w:pPr>
-      <w:proofErr w:type="spellStart"/>
       <w:r>
         <w:rPr>
           <w:rFonts w:ascii="Times New Roman" w:hAnsi="Times New Roman" w:cs="Times New Roman"/>
           <w:sz w:val="28"/>
           <w:szCs w:val="28"/>
         </w:rPr>
-        <w:t>Hướng</w:t>
-      </w:r>
-      <w:proofErr w:type="spellEnd"/>
-      <w:r>
-        <w:rPr>
-          <w:rFonts w:ascii="Times New Roman" w:hAnsi="Times New Roman" w:cs="Times New Roman"/>
-          <w:sz w:val="28"/>
-          <w:szCs w:val="28"/>
-        </w:rPr>
-        <w:t xml:space="preserve"> </w:t>
-      </w:r>
-      <w:proofErr w:type="spellStart"/>
-      <w:r>
-        <w:rPr>
-          <w:rFonts w:ascii="Times New Roman" w:hAnsi="Times New Roman" w:cs="Times New Roman"/>
-          <w:sz w:val="28"/>
-          <w:szCs w:val="28"/>
-        </w:rPr>
-        <w:t>dẫn</w:t>
-      </w:r>
-      <w:proofErr w:type="spellEnd"/>
-      <w:r>
-        <w:rPr>
-          <w:rFonts w:ascii="Times New Roman" w:hAnsi="Times New Roman" w:cs="Times New Roman"/>
-          <w:sz w:val="28"/>
-          <w:szCs w:val="28"/>
-        </w:rPr>
-        <w:t xml:space="preserve"> </w:t>
-      </w:r>
-      <w:proofErr w:type="spellStart"/>
-      <w:r>
-        <w:rPr>
-          <w:rFonts w:ascii="Times New Roman" w:hAnsi="Times New Roman" w:cs="Times New Roman"/>
-          <w:sz w:val="28"/>
-          <w:szCs w:val="28"/>
-        </w:rPr>
-        <w:t>sử</w:t>
-      </w:r>
-      <w:proofErr w:type="spellEnd"/>
-      <w:r>
-        <w:rPr>
-          <w:rFonts w:ascii="Times New Roman" w:hAnsi="Times New Roman" w:cs="Times New Roman"/>
-          <w:sz w:val="28"/>
-          <w:szCs w:val="28"/>
-        </w:rPr>
-        <w:t xml:space="preserve"> </w:t>
-      </w:r>
-      <w:proofErr w:type="spellStart"/>
-      <w:r>
-        <w:rPr>
-          <w:rFonts w:ascii="Times New Roman" w:hAnsi="Times New Roman" w:cs="Times New Roman"/>
-          <w:sz w:val="28"/>
-          <w:szCs w:val="28"/>
-        </w:rPr>
-        <w:t>dụng</w:t>
-      </w:r>
-      <w:proofErr w:type="spellEnd"/>
-      <w:r>
-        <w:rPr>
-          <w:rFonts w:ascii="Times New Roman" w:hAnsi="Times New Roman" w:cs="Times New Roman"/>
-          <w:sz w:val="28"/>
-          <w:szCs w:val="28"/>
-        </w:rPr>
-        <w:t xml:space="preserve"> stash</w:t>
+        <w:t>Hướng dẫn sử dụng stash</w:t>
       </w:r>
     </w:p>
     <w:p>
@@ -812,1406 +208,8 @@
           <w:sz w:val="28"/>
           <w:szCs w:val="28"/>
         </w:rPr>
-        <w:t xml:space="preserve">Git tag dung </w:t>
+        <w:t>Git tag dung để làm gì? Cách dùng như thế nào?</w:t>
       </w:r>
-      <w:proofErr w:type="spellStart"/>
-      <w:r>
-        <w:rPr>
-          <w:rFonts w:ascii="Times New Roman" w:hAnsi="Times New Roman" w:cs="Times New Roman"/>
-          <w:sz w:val="28"/>
-          <w:szCs w:val="28"/>
-        </w:rPr>
-        <w:t>để</w:t>
-      </w:r>
-      <w:proofErr w:type="spellEnd"/>
-      <w:r>
-        <w:rPr>
-          <w:rFonts w:ascii="Times New Roman" w:hAnsi="Times New Roman" w:cs="Times New Roman"/>
-          <w:sz w:val="28"/>
-          <w:szCs w:val="28"/>
-        </w:rPr>
-        <w:t xml:space="preserve"> </w:t>
-      </w:r>
-      <w:proofErr w:type="spellStart"/>
-      <w:r>
-        <w:rPr>
-          <w:rFonts w:ascii="Times New Roman" w:hAnsi="Times New Roman" w:cs="Times New Roman"/>
-          <w:sz w:val="28"/>
-          <w:szCs w:val="28"/>
-        </w:rPr>
-        <w:t>làm</w:t>
-      </w:r>
-      <w:proofErr w:type="spellEnd"/>
-      <w:r>
-        <w:rPr>
-          <w:rFonts w:ascii="Times New Roman" w:hAnsi="Times New Roman" w:cs="Times New Roman"/>
-          <w:sz w:val="28"/>
-          <w:szCs w:val="28"/>
-        </w:rPr>
-        <w:t xml:space="preserve"> </w:t>
-      </w:r>
-      <w:proofErr w:type="spellStart"/>
-      <w:r>
-        <w:rPr>
-          <w:rFonts w:ascii="Times New Roman" w:hAnsi="Times New Roman" w:cs="Times New Roman"/>
-          <w:sz w:val="28"/>
-          <w:szCs w:val="28"/>
-        </w:rPr>
-        <w:t>gì</w:t>
-      </w:r>
-      <w:proofErr w:type="spellEnd"/>
-      <w:r>
-        <w:rPr>
-          <w:rFonts w:ascii="Times New Roman" w:hAnsi="Times New Roman" w:cs="Times New Roman"/>
-          <w:sz w:val="28"/>
-          <w:szCs w:val="28"/>
-        </w:rPr>
-        <w:t xml:space="preserve">? </w:t>
-      </w:r>
-      <w:proofErr w:type="spellStart"/>
-      <w:r>
-        <w:rPr>
-          <w:rFonts w:ascii="Times New Roman" w:hAnsi="Times New Roman" w:cs="Times New Roman"/>
-          <w:sz w:val="28"/>
-          <w:szCs w:val="28"/>
-        </w:rPr>
-        <w:t>Cách</w:t>
-      </w:r>
-      <w:proofErr w:type="spellEnd"/>
-      <w:r>
-        <w:rPr>
-          <w:rFonts w:ascii="Times New Roman" w:hAnsi="Times New Roman" w:cs="Times New Roman"/>
-          <w:sz w:val="28"/>
-          <w:szCs w:val="28"/>
-        </w:rPr>
-        <w:t xml:space="preserve"> </w:t>
-      </w:r>
-      <w:proofErr w:type="spellStart"/>
-      <w:r>
-        <w:rPr>
-          <w:rFonts w:ascii="Times New Roman" w:hAnsi="Times New Roman" w:cs="Times New Roman"/>
-          <w:sz w:val="28"/>
-          <w:szCs w:val="28"/>
-        </w:rPr>
-        <w:t>dùng</w:t>
-      </w:r>
-      <w:proofErr w:type="spellEnd"/>
-      <w:r>
-        <w:rPr>
-          <w:rFonts w:ascii="Times New Roman" w:hAnsi="Times New Roman" w:cs="Times New Roman"/>
-          <w:sz w:val="28"/>
-          <w:szCs w:val="28"/>
-        </w:rPr>
-        <w:t xml:space="preserve"> </w:t>
-      </w:r>
-      <w:proofErr w:type="spellStart"/>
-      <w:r>
-        <w:rPr>
-          <w:rFonts w:ascii="Times New Roman" w:hAnsi="Times New Roman" w:cs="Times New Roman"/>
-          <w:sz w:val="28"/>
-          <w:szCs w:val="28"/>
-        </w:rPr>
-        <w:t>như</w:t>
-      </w:r>
-      <w:proofErr w:type="spellEnd"/>
-      <w:r>
-        <w:rPr>
-          <w:rFonts w:ascii="Times New Roman" w:hAnsi="Times New Roman" w:cs="Times New Roman"/>
-          <w:sz w:val="28"/>
-          <w:szCs w:val="28"/>
-        </w:rPr>
-        <w:t xml:space="preserve"> </w:t>
-      </w:r>
-      <w:proofErr w:type="spellStart"/>
-      <w:r>
-        <w:rPr>
-          <w:rFonts w:ascii="Times New Roman" w:hAnsi="Times New Roman" w:cs="Times New Roman"/>
-          <w:sz w:val="28"/>
-          <w:szCs w:val="28"/>
-        </w:rPr>
-        <w:t>thế</w:t>
-      </w:r>
-      <w:proofErr w:type="spellEnd"/>
-      <w:r>
-        <w:rPr>
-          <w:rFonts w:ascii="Times New Roman" w:hAnsi="Times New Roman" w:cs="Times New Roman"/>
-          <w:sz w:val="28"/>
-          <w:szCs w:val="28"/>
-        </w:rPr>
-        <w:t xml:space="preserve"> </w:t>
-      </w:r>
-      <w:proofErr w:type="spellStart"/>
-      <w:r>
-        <w:rPr>
-          <w:rFonts w:ascii="Times New Roman" w:hAnsi="Times New Roman" w:cs="Times New Roman"/>
-          <w:sz w:val="28"/>
-          <w:szCs w:val="28"/>
-        </w:rPr>
-        <w:t>nào</w:t>
-      </w:r>
-      <w:proofErr w:type="spellEnd"/>
-      <w:r>
-        <w:rPr>
-          <w:rFonts w:ascii="Times New Roman" w:hAnsi="Times New Roman" w:cs="Times New Roman"/>
-          <w:sz w:val="28"/>
-          <w:szCs w:val="28"/>
-        </w:rPr>
-        <w:t>?</w:t>
-      </w:r>
-    </w:p>
-    <w:p>
-      <w:pPr>
-        <w:pStyle w:val="ListParagraph"/>
-        <w:rPr>
-          <w:rFonts w:ascii="Times New Roman" w:hAnsi="Times New Roman" w:cs="Times New Roman"/>
-          <w:sz w:val="28"/>
-          <w:szCs w:val="28"/>
-        </w:rPr>
-      </w:pPr>
-      <w:r>
-        <w:rPr>
-          <w:rFonts w:ascii="Times New Roman" w:hAnsi="Times New Roman" w:cs="Times New Roman"/>
-          <w:sz w:val="28"/>
-          <w:szCs w:val="28"/>
-        </w:rPr>
-        <w:t xml:space="preserve">Git tag </w:t>
-      </w:r>
-      <w:proofErr w:type="spellStart"/>
-      <w:r>
-        <w:rPr>
-          <w:rFonts w:ascii="Times New Roman" w:hAnsi="Times New Roman" w:cs="Times New Roman"/>
-          <w:sz w:val="28"/>
-          <w:szCs w:val="28"/>
-        </w:rPr>
-        <w:t>dùng</w:t>
-      </w:r>
-      <w:proofErr w:type="spellEnd"/>
-      <w:r>
-        <w:rPr>
-          <w:rFonts w:ascii="Times New Roman" w:hAnsi="Times New Roman" w:cs="Times New Roman"/>
-          <w:sz w:val="28"/>
-          <w:szCs w:val="28"/>
-        </w:rPr>
-        <w:t xml:space="preserve"> </w:t>
-      </w:r>
-      <w:proofErr w:type="spellStart"/>
-      <w:r>
-        <w:rPr>
-          <w:rFonts w:ascii="Times New Roman" w:hAnsi="Times New Roman" w:cs="Times New Roman"/>
-          <w:sz w:val="28"/>
-          <w:szCs w:val="28"/>
-        </w:rPr>
-        <w:t>để</w:t>
-      </w:r>
-      <w:proofErr w:type="spellEnd"/>
-      <w:r>
-        <w:rPr>
-          <w:rFonts w:ascii="Times New Roman" w:hAnsi="Times New Roman" w:cs="Times New Roman"/>
-          <w:sz w:val="28"/>
-          <w:szCs w:val="28"/>
-        </w:rPr>
-        <w:t xml:space="preserve"> </w:t>
-      </w:r>
-      <w:proofErr w:type="spellStart"/>
-      <w:r>
-        <w:rPr>
-          <w:rFonts w:ascii="Times New Roman" w:hAnsi="Times New Roman" w:cs="Times New Roman"/>
-          <w:sz w:val="28"/>
-          <w:szCs w:val="28"/>
-        </w:rPr>
-        <w:t>đặt</w:t>
-      </w:r>
-      <w:proofErr w:type="spellEnd"/>
-      <w:r>
-        <w:rPr>
-          <w:rFonts w:ascii="Times New Roman" w:hAnsi="Times New Roman" w:cs="Times New Roman"/>
-          <w:sz w:val="28"/>
-          <w:szCs w:val="28"/>
-        </w:rPr>
-        <w:t xml:space="preserve"> </w:t>
-      </w:r>
-      <w:proofErr w:type="spellStart"/>
-      <w:r>
-        <w:rPr>
-          <w:rFonts w:ascii="Times New Roman" w:hAnsi="Times New Roman" w:cs="Times New Roman"/>
-          <w:sz w:val="28"/>
-          <w:szCs w:val="28"/>
-        </w:rPr>
-        <w:t>tên</w:t>
-      </w:r>
-      <w:proofErr w:type="spellEnd"/>
-      <w:r>
-        <w:rPr>
-          <w:rFonts w:ascii="Times New Roman" w:hAnsi="Times New Roman" w:cs="Times New Roman"/>
-          <w:sz w:val="28"/>
-          <w:szCs w:val="28"/>
-        </w:rPr>
-        <w:t xml:space="preserve"> </w:t>
-      </w:r>
-      <w:proofErr w:type="spellStart"/>
-      <w:r>
-        <w:rPr>
-          <w:rFonts w:ascii="Times New Roman" w:hAnsi="Times New Roman" w:cs="Times New Roman"/>
-          <w:sz w:val="28"/>
-          <w:szCs w:val="28"/>
-        </w:rPr>
-        <w:t>cho</w:t>
-      </w:r>
-      <w:proofErr w:type="spellEnd"/>
-      <w:r>
-        <w:rPr>
-          <w:rFonts w:ascii="Times New Roman" w:hAnsi="Times New Roman" w:cs="Times New Roman"/>
-          <w:sz w:val="28"/>
-          <w:szCs w:val="28"/>
-        </w:rPr>
-        <w:t xml:space="preserve"> </w:t>
-      </w:r>
-      <w:proofErr w:type="spellStart"/>
-      <w:r>
-        <w:rPr>
-          <w:rFonts w:ascii="Times New Roman" w:hAnsi="Times New Roman" w:cs="Times New Roman"/>
-          <w:sz w:val="28"/>
-          <w:szCs w:val="28"/>
-        </w:rPr>
-        <w:t>một</w:t>
-      </w:r>
-      <w:proofErr w:type="spellEnd"/>
-      <w:r>
-        <w:rPr>
-          <w:rFonts w:ascii="Times New Roman" w:hAnsi="Times New Roman" w:cs="Times New Roman"/>
-          <w:sz w:val="28"/>
-          <w:szCs w:val="28"/>
-        </w:rPr>
-        <w:t xml:space="preserve"> commit </w:t>
-      </w:r>
-      <w:proofErr w:type="spellStart"/>
-      <w:r>
-        <w:rPr>
-          <w:rFonts w:ascii="Times New Roman" w:hAnsi="Times New Roman" w:cs="Times New Roman"/>
-          <w:sz w:val="28"/>
-          <w:szCs w:val="28"/>
-        </w:rPr>
-        <w:t>cụ</w:t>
-      </w:r>
-      <w:proofErr w:type="spellEnd"/>
-      <w:r>
-        <w:rPr>
-          <w:rFonts w:ascii="Times New Roman" w:hAnsi="Times New Roman" w:cs="Times New Roman"/>
-          <w:sz w:val="28"/>
-          <w:szCs w:val="28"/>
-        </w:rPr>
-        <w:t xml:space="preserve"> </w:t>
-      </w:r>
-      <w:proofErr w:type="spellStart"/>
-      <w:r>
-        <w:rPr>
-          <w:rFonts w:ascii="Times New Roman" w:hAnsi="Times New Roman" w:cs="Times New Roman"/>
-          <w:sz w:val="28"/>
-          <w:szCs w:val="28"/>
-        </w:rPr>
-        <w:t>thể</w:t>
-      </w:r>
-      <w:proofErr w:type="spellEnd"/>
-      <w:r>
-        <w:rPr>
-          <w:rFonts w:ascii="Times New Roman" w:hAnsi="Times New Roman" w:cs="Times New Roman"/>
-          <w:sz w:val="28"/>
-          <w:szCs w:val="28"/>
-        </w:rPr>
-        <w:t xml:space="preserve"> </w:t>
-      </w:r>
-      <w:proofErr w:type="spellStart"/>
-      <w:r>
-        <w:rPr>
-          <w:rFonts w:ascii="Times New Roman" w:hAnsi="Times New Roman" w:cs="Times New Roman"/>
-          <w:sz w:val="28"/>
-          <w:szCs w:val="28"/>
-        </w:rPr>
-        <w:t>trong</w:t>
-      </w:r>
-      <w:proofErr w:type="spellEnd"/>
-      <w:r>
-        <w:rPr>
-          <w:rFonts w:ascii="Times New Roman" w:hAnsi="Times New Roman" w:cs="Times New Roman"/>
-          <w:sz w:val="28"/>
-          <w:szCs w:val="28"/>
-        </w:rPr>
-        <w:t xml:space="preserve"> </w:t>
-      </w:r>
-      <w:proofErr w:type="spellStart"/>
-      <w:r>
-        <w:rPr>
-          <w:rFonts w:ascii="Times New Roman" w:hAnsi="Times New Roman" w:cs="Times New Roman"/>
-          <w:sz w:val="28"/>
-          <w:szCs w:val="28"/>
-        </w:rPr>
-        <w:t>lịch</w:t>
-      </w:r>
-      <w:proofErr w:type="spellEnd"/>
-      <w:r>
-        <w:rPr>
-          <w:rFonts w:ascii="Times New Roman" w:hAnsi="Times New Roman" w:cs="Times New Roman"/>
-          <w:sz w:val="28"/>
-          <w:szCs w:val="28"/>
-        </w:rPr>
-        <w:t xml:space="preserve"> </w:t>
-      </w:r>
-      <w:proofErr w:type="spellStart"/>
-      <w:r>
-        <w:rPr>
-          <w:rFonts w:ascii="Times New Roman" w:hAnsi="Times New Roman" w:cs="Times New Roman"/>
-          <w:sz w:val="28"/>
-          <w:szCs w:val="28"/>
-        </w:rPr>
-        <w:t>sử</w:t>
-      </w:r>
-      <w:proofErr w:type="spellEnd"/>
-      <w:r>
-        <w:rPr>
-          <w:rFonts w:ascii="Times New Roman" w:hAnsi="Times New Roman" w:cs="Times New Roman"/>
-          <w:sz w:val="28"/>
-          <w:szCs w:val="28"/>
-        </w:rPr>
-        <w:t xml:space="preserve">, </w:t>
-      </w:r>
-      <w:proofErr w:type="spellStart"/>
-      <w:r>
-        <w:rPr>
-          <w:rFonts w:ascii="Times New Roman" w:hAnsi="Times New Roman" w:cs="Times New Roman"/>
-          <w:sz w:val="28"/>
-          <w:szCs w:val="28"/>
-        </w:rPr>
-        <w:t>thường</w:t>
-      </w:r>
-      <w:proofErr w:type="spellEnd"/>
-      <w:r>
-        <w:rPr>
-          <w:rFonts w:ascii="Times New Roman" w:hAnsi="Times New Roman" w:cs="Times New Roman"/>
-          <w:sz w:val="28"/>
-          <w:szCs w:val="28"/>
-        </w:rPr>
-        <w:t xml:space="preserve"> </w:t>
-      </w:r>
-      <w:proofErr w:type="spellStart"/>
-      <w:r>
-        <w:rPr>
-          <w:rFonts w:ascii="Times New Roman" w:hAnsi="Times New Roman" w:cs="Times New Roman"/>
-          <w:sz w:val="28"/>
-          <w:szCs w:val="28"/>
-        </w:rPr>
-        <w:t>để</w:t>
-      </w:r>
-      <w:proofErr w:type="spellEnd"/>
-      <w:r>
-        <w:rPr>
-          <w:rFonts w:ascii="Times New Roman" w:hAnsi="Times New Roman" w:cs="Times New Roman"/>
-          <w:sz w:val="28"/>
-          <w:szCs w:val="28"/>
-        </w:rPr>
-        <w:t xml:space="preserve"> </w:t>
-      </w:r>
-      <w:proofErr w:type="spellStart"/>
-      <w:r>
-        <w:rPr>
-          <w:rFonts w:ascii="Times New Roman" w:hAnsi="Times New Roman" w:cs="Times New Roman"/>
-          <w:sz w:val="28"/>
-          <w:szCs w:val="28"/>
-        </w:rPr>
-        <w:t>chỉ</w:t>
-      </w:r>
-      <w:proofErr w:type="spellEnd"/>
-      <w:r>
-        <w:rPr>
-          <w:rFonts w:ascii="Times New Roman" w:hAnsi="Times New Roman" w:cs="Times New Roman"/>
-          <w:sz w:val="28"/>
-          <w:szCs w:val="28"/>
-        </w:rPr>
-        <w:t xml:space="preserve"> </w:t>
-      </w:r>
-      <w:proofErr w:type="spellStart"/>
-      <w:r>
-        <w:rPr>
-          <w:rFonts w:ascii="Times New Roman" w:hAnsi="Times New Roman" w:cs="Times New Roman"/>
-          <w:sz w:val="28"/>
-          <w:szCs w:val="28"/>
-        </w:rPr>
-        <w:t>ra</w:t>
-      </w:r>
-      <w:proofErr w:type="spellEnd"/>
-      <w:r>
-        <w:rPr>
-          <w:rFonts w:ascii="Times New Roman" w:hAnsi="Times New Roman" w:cs="Times New Roman"/>
-          <w:sz w:val="28"/>
-          <w:szCs w:val="28"/>
-        </w:rPr>
-        <w:t xml:space="preserve"> </w:t>
-      </w:r>
-      <w:proofErr w:type="spellStart"/>
-      <w:r>
-        <w:rPr>
-          <w:rFonts w:ascii="Times New Roman" w:hAnsi="Times New Roman" w:cs="Times New Roman"/>
-          <w:sz w:val="28"/>
-          <w:szCs w:val="28"/>
-        </w:rPr>
-        <w:t>phiên</w:t>
-      </w:r>
-      <w:proofErr w:type="spellEnd"/>
-      <w:r>
-        <w:rPr>
-          <w:rFonts w:ascii="Times New Roman" w:hAnsi="Times New Roman" w:cs="Times New Roman"/>
-          <w:sz w:val="28"/>
-          <w:szCs w:val="28"/>
-        </w:rPr>
-        <w:t xml:space="preserve"> </w:t>
-      </w:r>
-      <w:proofErr w:type="spellStart"/>
-      <w:r>
-        <w:rPr>
-          <w:rFonts w:ascii="Times New Roman" w:hAnsi="Times New Roman" w:cs="Times New Roman"/>
-          <w:sz w:val="28"/>
-          <w:szCs w:val="28"/>
-        </w:rPr>
-        <w:t>bản</w:t>
-      </w:r>
-      <w:proofErr w:type="spellEnd"/>
-      <w:r>
-        <w:rPr>
-          <w:rFonts w:ascii="Times New Roman" w:hAnsi="Times New Roman" w:cs="Times New Roman"/>
-          <w:sz w:val="28"/>
-          <w:szCs w:val="28"/>
-        </w:rPr>
-        <w:t xml:space="preserve"> </w:t>
-      </w:r>
-      <w:proofErr w:type="spellStart"/>
-      <w:r>
-        <w:rPr>
-          <w:rFonts w:ascii="Times New Roman" w:hAnsi="Times New Roman" w:cs="Times New Roman"/>
-          <w:sz w:val="28"/>
-          <w:szCs w:val="28"/>
-        </w:rPr>
-        <w:t>phát</w:t>
-      </w:r>
-      <w:proofErr w:type="spellEnd"/>
-      <w:r>
-        <w:rPr>
-          <w:rFonts w:ascii="Times New Roman" w:hAnsi="Times New Roman" w:cs="Times New Roman"/>
-          <w:sz w:val="28"/>
-          <w:szCs w:val="28"/>
-        </w:rPr>
-        <w:t xml:space="preserve"> </w:t>
-      </w:r>
-      <w:proofErr w:type="spellStart"/>
-      <w:r>
-        <w:rPr>
-          <w:rFonts w:ascii="Times New Roman" w:hAnsi="Times New Roman" w:cs="Times New Roman"/>
-          <w:sz w:val="28"/>
-          <w:szCs w:val="28"/>
-        </w:rPr>
-        <w:t>hành</w:t>
-      </w:r>
-      <w:proofErr w:type="spellEnd"/>
-      <w:r>
-        <w:rPr>
-          <w:rFonts w:ascii="Times New Roman" w:hAnsi="Times New Roman" w:cs="Times New Roman"/>
-          <w:sz w:val="28"/>
-          <w:szCs w:val="28"/>
-        </w:rPr>
-        <w:t xml:space="preserve"> </w:t>
-      </w:r>
-      <w:proofErr w:type="spellStart"/>
-      <w:r>
-        <w:rPr>
-          <w:rFonts w:ascii="Times New Roman" w:hAnsi="Times New Roman" w:cs="Times New Roman"/>
-          <w:sz w:val="28"/>
-          <w:szCs w:val="28"/>
-        </w:rPr>
-        <w:t>của</w:t>
-      </w:r>
-      <w:proofErr w:type="spellEnd"/>
-      <w:r>
-        <w:rPr>
-          <w:rFonts w:ascii="Times New Roman" w:hAnsi="Times New Roman" w:cs="Times New Roman"/>
-          <w:sz w:val="28"/>
-          <w:szCs w:val="28"/>
-        </w:rPr>
-        <w:t xml:space="preserve"> </w:t>
-      </w:r>
-      <w:proofErr w:type="spellStart"/>
-      <w:r>
-        <w:rPr>
-          <w:rFonts w:ascii="Times New Roman" w:hAnsi="Times New Roman" w:cs="Times New Roman"/>
-          <w:sz w:val="28"/>
-          <w:szCs w:val="28"/>
-        </w:rPr>
-        <w:t>dự</w:t>
-      </w:r>
-      <w:proofErr w:type="spellEnd"/>
-      <w:r>
-        <w:rPr>
-          <w:rFonts w:ascii="Times New Roman" w:hAnsi="Times New Roman" w:cs="Times New Roman"/>
-          <w:sz w:val="28"/>
-          <w:szCs w:val="28"/>
-        </w:rPr>
-        <w:t xml:space="preserve"> </w:t>
-      </w:r>
-      <w:proofErr w:type="spellStart"/>
-      <w:r>
-        <w:rPr>
-          <w:rFonts w:ascii="Times New Roman" w:hAnsi="Times New Roman" w:cs="Times New Roman"/>
-          <w:sz w:val="28"/>
-          <w:szCs w:val="28"/>
-        </w:rPr>
-        <w:t>án</w:t>
-      </w:r>
-      <w:proofErr w:type="spellEnd"/>
-      <w:r>
-        <w:rPr>
-          <w:rFonts w:ascii="Times New Roman" w:hAnsi="Times New Roman" w:cs="Times New Roman"/>
-          <w:sz w:val="28"/>
-          <w:szCs w:val="28"/>
-        </w:rPr>
-        <w:t xml:space="preserve">, </w:t>
-      </w:r>
-      <w:proofErr w:type="spellStart"/>
-      <w:r>
-        <w:rPr>
-          <w:rFonts w:ascii="Times New Roman" w:hAnsi="Times New Roman" w:cs="Times New Roman"/>
-          <w:sz w:val="28"/>
-          <w:szCs w:val="28"/>
-        </w:rPr>
-        <w:t>chỉ</w:t>
-      </w:r>
-      <w:proofErr w:type="spellEnd"/>
-      <w:r>
-        <w:rPr>
-          <w:rFonts w:ascii="Times New Roman" w:hAnsi="Times New Roman" w:cs="Times New Roman"/>
-          <w:sz w:val="28"/>
-          <w:szCs w:val="28"/>
-        </w:rPr>
-        <w:t xml:space="preserve"> </w:t>
-      </w:r>
-      <w:proofErr w:type="spellStart"/>
-      <w:r>
-        <w:rPr>
-          <w:rFonts w:ascii="Times New Roman" w:hAnsi="Times New Roman" w:cs="Times New Roman"/>
-          <w:sz w:val="28"/>
-          <w:szCs w:val="28"/>
-        </w:rPr>
-        <w:t>định</w:t>
-      </w:r>
-      <w:proofErr w:type="spellEnd"/>
-      <w:r>
-        <w:rPr>
-          <w:rFonts w:ascii="Times New Roman" w:hAnsi="Times New Roman" w:cs="Times New Roman"/>
-          <w:sz w:val="28"/>
-          <w:szCs w:val="28"/>
-        </w:rPr>
-        <w:t xml:space="preserve"> </w:t>
-      </w:r>
-      <w:proofErr w:type="spellStart"/>
-      <w:r>
-        <w:rPr>
-          <w:rFonts w:ascii="Times New Roman" w:hAnsi="Times New Roman" w:cs="Times New Roman"/>
-          <w:sz w:val="28"/>
-          <w:szCs w:val="28"/>
-        </w:rPr>
-        <w:t>một</w:t>
-      </w:r>
-      <w:proofErr w:type="spellEnd"/>
-      <w:r>
-        <w:rPr>
-          <w:rFonts w:ascii="Times New Roman" w:hAnsi="Times New Roman" w:cs="Times New Roman"/>
-          <w:sz w:val="28"/>
-          <w:szCs w:val="28"/>
-        </w:rPr>
-        <w:t xml:space="preserve"> </w:t>
-      </w:r>
-      <w:proofErr w:type="spellStart"/>
-      <w:r>
-        <w:rPr>
-          <w:rFonts w:ascii="Times New Roman" w:hAnsi="Times New Roman" w:cs="Times New Roman"/>
-          <w:sz w:val="28"/>
-          <w:szCs w:val="28"/>
-        </w:rPr>
-        <w:t>điểm</w:t>
-      </w:r>
-      <w:proofErr w:type="spellEnd"/>
-      <w:r>
-        <w:rPr>
-          <w:rFonts w:ascii="Times New Roman" w:hAnsi="Times New Roman" w:cs="Times New Roman"/>
-          <w:sz w:val="28"/>
-          <w:szCs w:val="28"/>
-        </w:rPr>
-        <w:t xml:space="preserve"> </w:t>
-      </w:r>
-      <w:proofErr w:type="spellStart"/>
-      <w:r>
-        <w:rPr>
-          <w:rFonts w:ascii="Times New Roman" w:hAnsi="Times New Roman" w:cs="Times New Roman"/>
-          <w:sz w:val="28"/>
-          <w:szCs w:val="28"/>
-        </w:rPr>
-        <w:t>quan</w:t>
-      </w:r>
-      <w:proofErr w:type="spellEnd"/>
-      <w:r>
-        <w:rPr>
-          <w:rFonts w:ascii="Times New Roman" w:hAnsi="Times New Roman" w:cs="Times New Roman"/>
-          <w:sz w:val="28"/>
-          <w:szCs w:val="28"/>
-        </w:rPr>
-        <w:t xml:space="preserve"> </w:t>
-      </w:r>
-      <w:proofErr w:type="spellStart"/>
-      <w:r>
-        <w:rPr>
-          <w:rFonts w:ascii="Times New Roman" w:hAnsi="Times New Roman" w:cs="Times New Roman"/>
-          <w:sz w:val="28"/>
-          <w:szCs w:val="28"/>
-        </w:rPr>
-        <w:t>trong</w:t>
-      </w:r>
-      <w:proofErr w:type="spellEnd"/>
-      <w:r>
-        <w:rPr>
-          <w:rFonts w:ascii="Times New Roman" w:hAnsi="Times New Roman" w:cs="Times New Roman"/>
-          <w:sz w:val="28"/>
-          <w:szCs w:val="28"/>
-        </w:rPr>
-        <w:t xml:space="preserve"> </w:t>
-      </w:r>
-      <w:proofErr w:type="spellStart"/>
-      <w:r>
-        <w:rPr>
-          <w:rFonts w:ascii="Times New Roman" w:hAnsi="Times New Roman" w:cs="Times New Roman"/>
-          <w:sz w:val="28"/>
-          <w:szCs w:val="28"/>
-        </w:rPr>
-        <w:t>trong</w:t>
-      </w:r>
-      <w:proofErr w:type="spellEnd"/>
-      <w:r>
-        <w:rPr>
-          <w:rFonts w:ascii="Times New Roman" w:hAnsi="Times New Roman" w:cs="Times New Roman"/>
-          <w:sz w:val="28"/>
-          <w:szCs w:val="28"/>
-        </w:rPr>
-        <w:t xml:space="preserve"> </w:t>
-      </w:r>
-      <w:proofErr w:type="spellStart"/>
-      <w:r>
-        <w:rPr>
-          <w:rFonts w:ascii="Times New Roman" w:hAnsi="Times New Roman" w:cs="Times New Roman"/>
-          <w:sz w:val="28"/>
-          <w:szCs w:val="28"/>
-        </w:rPr>
-        <w:t>lịch</w:t>
-      </w:r>
-      <w:proofErr w:type="spellEnd"/>
-      <w:r>
-        <w:rPr>
-          <w:rFonts w:ascii="Times New Roman" w:hAnsi="Times New Roman" w:cs="Times New Roman"/>
-          <w:sz w:val="28"/>
-          <w:szCs w:val="28"/>
-        </w:rPr>
-        <w:t xml:space="preserve"> </w:t>
-      </w:r>
-      <w:proofErr w:type="spellStart"/>
-      <w:r>
-        <w:rPr>
-          <w:rFonts w:ascii="Times New Roman" w:hAnsi="Times New Roman" w:cs="Times New Roman"/>
-          <w:sz w:val="28"/>
-          <w:szCs w:val="28"/>
-        </w:rPr>
-        <w:t>sử</w:t>
-      </w:r>
-      <w:proofErr w:type="spellEnd"/>
-      <w:r>
-        <w:rPr>
-          <w:rFonts w:ascii="Times New Roman" w:hAnsi="Times New Roman" w:cs="Times New Roman"/>
-          <w:sz w:val="28"/>
-          <w:szCs w:val="28"/>
-        </w:rPr>
-        <w:t xml:space="preserve"> </w:t>
-      </w:r>
-      <w:proofErr w:type="spellStart"/>
-      <w:r>
-        <w:rPr>
-          <w:rFonts w:ascii="Times New Roman" w:hAnsi="Times New Roman" w:cs="Times New Roman"/>
-          <w:sz w:val="28"/>
-          <w:szCs w:val="28"/>
-        </w:rPr>
-        <w:t>để</w:t>
-      </w:r>
-      <w:proofErr w:type="spellEnd"/>
-      <w:r>
-        <w:rPr>
-          <w:rFonts w:ascii="Times New Roman" w:hAnsi="Times New Roman" w:cs="Times New Roman"/>
-          <w:sz w:val="28"/>
-          <w:szCs w:val="28"/>
-        </w:rPr>
-        <w:t xml:space="preserve"> quay </w:t>
-      </w:r>
-      <w:proofErr w:type="spellStart"/>
-      <w:r>
-        <w:rPr>
-          <w:rFonts w:ascii="Times New Roman" w:hAnsi="Times New Roman" w:cs="Times New Roman"/>
-          <w:sz w:val="28"/>
-          <w:szCs w:val="28"/>
-        </w:rPr>
-        <w:t>lại</w:t>
-      </w:r>
-      <w:proofErr w:type="spellEnd"/>
-      <w:r>
-        <w:rPr>
-          <w:rFonts w:ascii="Times New Roman" w:hAnsi="Times New Roman" w:cs="Times New Roman"/>
-          <w:sz w:val="28"/>
-          <w:szCs w:val="28"/>
-        </w:rPr>
-        <w:t xml:space="preserve"> </w:t>
-      </w:r>
-      <w:proofErr w:type="spellStart"/>
-      <w:r>
-        <w:rPr>
-          <w:rFonts w:ascii="Times New Roman" w:hAnsi="Times New Roman" w:cs="Times New Roman"/>
-          <w:sz w:val="28"/>
-          <w:szCs w:val="28"/>
-        </w:rPr>
-        <w:t>dễ</w:t>
-      </w:r>
-      <w:proofErr w:type="spellEnd"/>
-      <w:r>
-        <w:rPr>
-          <w:rFonts w:ascii="Times New Roman" w:hAnsi="Times New Roman" w:cs="Times New Roman"/>
-          <w:sz w:val="28"/>
-          <w:szCs w:val="28"/>
-        </w:rPr>
-        <w:t xml:space="preserve"> </w:t>
-      </w:r>
-      <w:proofErr w:type="spellStart"/>
-      <w:r>
-        <w:rPr>
-          <w:rFonts w:ascii="Times New Roman" w:hAnsi="Times New Roman" w:cs="Times New Roman"/>
-          <w:sz w:val="28"/>
-          <w:szCs w:val="28"/>
-        </w:rPr>
-        <w:t>hơn</w:t>
-      </w:r>
-      <w:proofErr w:type="spellEnd"/>
-      <w:r>
-        <w:rPr>
-          <w:rFonts w:ascii="Times New Roman" w:hAnsi="Times New Roman" w:cs="Times New Roman"/>
-          <w:sz w:val="28"/>
-          <w:szCs w:val="28"/>
-        </w:rPr>
-        <w:t>.</w:t>
-      </w:r>
-    </w:p>
-    <w:p>
-      <w:pPr>
-        <w:pStyle w:val="ListParagraph"/>
-        <w:rPr>
-          <w:rFonts w:ascii="Times New Roman" w:hAnsi="Times New Roman" w:cs="Times New Roman"/>
-          <w:sz w:val="28"/>
-          <w:szCs w:val="28"/>
-          <w:u w:val="single"/>
-        </w:rPr>
-      </w:pPr>
-      <w:proofErr w:type="spellStart"/>
-      <w:r>
-        <w:rPr>
-          <w:rFonts w:ascii="Times New Roman" w:hAnsi="Times New Roman" w:cs="Times New Roman"/>
-          <w:sz w:val="28"/>
-          <w:szCs w:val="28"/>
-          <w:u w:val="single"/>
-        </w:rPr>
-        <w:t>Cách</w:t>
-      </w:r>
-      <w:proofErr w:type="spellEnd"/>
-      <w:r>
-        <w:rPr>
-          <w:rFonts w:ascii="Times New Roman" w:hAnsi="Times New Roman" w:cs="Times New Roman"/>
-          <w:sz w:val="28"/>
-          <w:szCs w:val="28"/>
-          <w:u w:val="single"/>
-        </w:rPr>
-        <w:t xml:space="preserve"> </w:t>
-      </w:r>
-      <w:proofErr w:type="spellStart"/>
-      <w:r>
-        <w:rPr>
-          <w:rFonts w:ascii="Times New Roman" w:hAnsi="Times New Roman" w:cs="Times New Roman"/>
-          <w:sz w:val="28"/>
-          <w:szCs w:val="28"/>
-          <w:u w:val="single"/>
-        </w:rPr>
-        <w:t>dùng</w:t>
-      </w:r>
-      <w:proofErr w:type="spellEnd"/>
-      <w:r>
-        <w:rPr>
-          <w:rFonts w:ascii="Times New Roman" w:hAnsi="Times New Roman" w:cs="Times New Roman"/>
-          <w:sz w:val="28"/>
-          <w:szCs w:val="28"/>
-          <w:u w:val="single"/>
-        </w:rPr>
-        <w:t>:</w:t>
-      </w:r>
-      <w:r>
-        <w:rPr>
-          <w:rFonts w:ascii="Times New Roman" w:hAnsi="Times New Roman" w:cs="Times New Roman"/>
-          <w:sz w:val="28"/>
-          <w:szCs w:val="28"/>
-          <w:u w:val="single"/>
-        </w:rPr>
-        <w:t xml:space="preserve"> </w:t>
-      </w:r>
-      <w:proofErr w:type="spellStart"/>
-      <w:r>
-        <w:rPr>
-          <w:rFonts w:ascii="Times New Roman" w:hAnsi="Times New Roman" w:cs="Times New Roman"/>
-          <w:sz w:val="28"/>
-          <w:szCs w:val="28"/>
-          <w:u w:val="single"/>
-        </w:rPr>
-        <w:t>Tạo</w:t>
-      </w:r>
-      <w:proofErr w:type="spellEnd"/>
-      <w:r>
-        <w:rPr>
-          <w:rFonts w:ascii="Times New Roman" w:hAnsi="Times New Roman" w:cs="Times New Roman"/>
-          <w:sz w:val="28"/>
-          <w:szCs w:val="28"/>
-          <w:u w:val="single"/>
-        </w:rPr>
-        <w:t xml:space="preserve"> </w:t>
-      </w:r>
-      <w:proofErr w:type="spellStart"/>
-      <w:r>
-        <w:rPr>
-          <w:rFonts w:ascii="Times New Roman" w:hAnsi="Times New Roman" w:cs="Times New Roman"/>
-          <w:sz w:val="28"/>
-          <w:szCs w:val="28"/>
-          <w:u w:val="single"/>
-        </w:rPr>
-        <w:t>ra</w:t>
-      </w:r>
-      <w:proofErr w:type="spellEnd"/>
-      <w:r>
-        <w:rPr>
-          <w:rFonts w:ascii="Times New Roman" w:hAnsi="Times New Roman" w:cs="Times New Roman"/>
-          <w:sz w:val="28"/>
-          <w:szCs w:val="28"/>
-          <w:u w:val="single"/>
-        </w:rPr>
-        <w:t xml:space="preserve"> 1 file duy1</w:t>
-      </w:r>
-    </w:p>
-    <w:p>
-      <w:pPr>
-        <w:pStyle w:val="ListParagraph"/>
-        <w:rPr>
-          <w:rFonts w:ascii="Times New Roman" w:hAnsi="Times New Roman" w:cs="Times New Roman"/>
-          <w:sz w:val="28"/>
-          <w:szCs w:val="28"/>
-          <w:u w:val="single"/>
-        </w:rPr>
-      </w:pPr>
-      <w:r>
-        <w:rPr>
-          <w:rFonts w:ascii="Times New Roman" w:hAnsi="Times New Roman" w:cs="Times New Roman"/>
-          <w:sz w:val="28"/>
-          <w:szCs w:val="28"/>
-          <w:u w:val="single"/>
-        </w:rPr>
-        <w:drawing>
-          <wp:inline distT="0" distB="0" distL="0" distR="0" wp14:anchorId="593DB6A6" wp14:editId="2F94D2C0">
-            <wp:extent cx="5915851" cy="2648320"/>
-            <wp:effectExtent l="0" t="0" r="0" b="0"/>
-            <wp:docPr id="980326412" name="Picture 1" descr="A screen shot of a computer&#10;&#10;Description automatically generated"/>
-            <wp:cNvGraphicFramePr>
-              <a:graphicFrameLocks xmlns:a="http://schemas.openxmlformats.org/drawingml/2006/main" noChangeAspect="1"/>
-            </wp:cNvGraphicFramePr>
-            <a:graphic xmlns:a="http://schemas.openxmlformats.org/drawingml/2006/main">
-              <a:graphicData uri="http://schemas.openxmlformats.org/drawingml/2006/picture">
-                <pic:pic xmlns:pic="http://schemas.openxmlformats.org/drawingml/2006/picture">
-                  <pic:nvPicPr>
-                    <pic:cNvPr id="980326412" name="Picture 1" descr="A screen shot of a computer&#10;&#10;Description automatically generated"/>
-                    <pic:cNvPicPr/>
-                  </pic:nvPicPr>
-                  <pic:blipFill>
-                    <a:blip r:embed="rId5"/>
-                    <a:stretch>
-                      <a:fillRect/>
-                    </a:stretch>
-                  </pic:blipFill>
-                  <pic:spPr>
-                    <a:xfrm>
-                      <a:off x="0" y="0"/>
-                      <a:ext cx="5915851" cy="2648320"/>
-                    </a:xfrm>
-                    <a:prstGeom prst="rect">
-                      <a:avLst/>
-                    </a:prstGeom>
-                  </pic:spPr>
-                </pic:pic>
-              </a:graphicData>
-            </a:graphic>
-          </wp:inline>
-        </w:drawing>
-      </w:r>
-    </w:p>
-    <w:p>
-      <w:pPr>
-        <w:pStyle w:val="ListParagraph"/>
-        <w:rPr>
-          <w:rFonts w:ascii="Times New Roman" w:hAnsi="Times New Roman" w:cs="Times New Roman"/>
-          <w:sz w:val="28"/>
-          <w:szCs w:val="28"/>
-          <w:u w:val="single"/>
-        </w:rPr>
-      </w:pPr>
-    </w:p>
-    <w:p>
-      <w:pPr>
-        <w:pStyle w:val="ListParagraph"/>
-        <w:numPr>
-          <w:ilvl w:val="0"/>
-          <w:numId w:val="25"/>
-        </w:numPr>
-        <w:rPr>
-          <w:rFonts w:ascii="Times New Roman" w:hAnsi="Times New Roman" w:cs="Times New Roman"/>
-          <w:sz w:val="28"/>
-          <w:szCs w:val="28"/>
-          <w:u w:val="single"/>
-        </w:rPr>
-      </w:pPr>
-      <w:r>
-        <w:rPr>
-          <w:rFonts w:ascii="Times New Roman" w:hAnsi="Times New Roman" w:cs="Times New Roman"/>
-          <w:sz w:val="28"/>
-          <w:szCs w:val="28"/>
-          <w:u w:val="single"/>
-        </w:rPr>
-        <w:t xml:space="preserve">Commit file </w:t>
-      </w:r>
-      <w:proofErr w:type="spellStart"/>
-      <w:r>
-        <w:rPr>
-          <w:rFonts w:ascii="Times New Roman" w:hAnsi="Times New Roman" w:cs="Times New Roman"/>
-          <w:sz w:val="28"/>
-          <w:szCs w:val="28"/>
-          <w:u w:val="single"/>
-        </w:rPr>
-        <w:t>lên</w:t>
-      </w:r>
-      <w:proofErr w:type="spellEnd"/>
-      <w:r>
-        <w:rPr>
-          <w:rFonts w:ascii="Times New Roman" w:hAnsi="Times New Roman" w:cs="Times New Roman"/>
-          <w:sz w:val="28"/>
-          <w:szCs w:val="28"/>
-          <w:u w:val="single"/>
-        </w:rPr>
-        <w:t xml:space="preserve"> </w:t>
-      </w:r>
-      <w:proofErr w:type="spellStart"/>
-      <w:r>
-        <w:rPr>
-          <w:rFonts w:ascii="Times New Roman" w:hAnsi="Times New Roman" w:cs="Times New Roman"/>
-          <w:sz w:val="28"/>
-          <w:szCs w:val="28"/>
-          <w:u w:val="single"/>
-        </w:rPr>
-        <w:t>thì</w:t>
-      </w:r>
-      <w:proofErr w:type="spellEnd"/>
-      <w:r>
-        <w:rPr>
-          <w:rFonts w:ascii="Times New Roman" w:hAnsi="Times New Roman" w:cs="Times New Roman"/>
-          <w:sz w:val="28"/>
-          <w:szCs w:val="28"/>
-          <w:u w:val="single"/>
-        </w:rPr>
-        <w:t xml:space="preserve"> </w:t>
-      </w:r>
-      <w:proofErr w:type="spellStart"/>
-      <w:r>
-        <w:rPr>
-          <w:rFonts w:ascii="Times New Roman" w:hAnsi="Times New Roman" w:cs="Times New Roman"/>
-          <w:sz w:val="28"/>
-          <w:szCs w:val="28"/>
-          <w:u w:val="single"/>
-        </w:rPr>
-        <w:t>lúc</w:t>
-      </w:r>
-      <w:proofErr w:type="spellEnd"/>
-      <w:r>
-        <w:rPr>
-          <w:rFonts w:ascii="Times New Roman" w:hAnsi="Times New Roman" w:cs="Times New Roman"/>
-          <w:sz w:val="28"/>
-          <w:szCs w:val="28"/>
-          <w:u w:val="single"/>
-        </w:rPr>
-        <w:t xml:space="preserve"> </w:t>
-      </w:r>
-      <w:proofErr w:type="spellStart"/>
-      <w:r>
-        <w:rPr>
-          <w:rFonts w:ascii="Times New Roman" w:hAnsi="Times New Roman" w:cs="Times New Roman"/>
-          <w:sz w:val="28"/>
-          <w:szCs w:val="28"/>
-          <w:u w:val="single"/>
-        </w:rPr>
-        <w:t>này</w:t>
-      </w:r>
-      <w:proofErr w:type="spellEnd"/>
-      <w:r>
-        <w:rPr>
-          <w:rFonts w:ascii="Times New Roman" w:hAnsi="Times New Roman" w:cs="Times New Roman"/>
-          <w:sz w:val="28"/>
-          <w:szCs w:val="28"/>
-          <w:u w:val="single"/>
-        </w:rPr>
-        <w:t xml:space="preserve"> commit </w:t>
-      </w:r>
-      <w:proofErr w:type="spellStart"/>
-      <w:r>
-        <w:rPr>
-          <w:rFonts w:ascii="Times New Roman" w:hAnsi="Times New Roman" w:cs="Times New Roman"/>
-          <w:sz w:val="28"/>
-          <w:szCs w:val="28"/>
-          <w:u w:val="single"/>
-        </w:rPr>
-        <w:t>đang</w:t>
-      </w:r>
-      <w:proofErr w:type="spellEnd"/>
-      <w:r>
-        <w:rPr>
-          <w:rFonts w:ascii="Times New Roman" w:hAnsi="Times New Roman" w:cs="Times New Roman"/>
-          <w:sz w:val="28"/>
-          <w:szCs w:val="28"/>
-          <w:u w:val="single"/>
-        </w:rPr>
-        <w:t xml:space="preserve"> </w:t>
-      </w:r>
-      <w:proofErr w:type="spellStart"/>
-      <w:r>
-        <w:rPr>
-          <w:rFonts w:ascii="Times New Roman" w:hAnsi="Times New Roman" w:cs="Times New Roman"/>
-          <w:sz w:val="28"/>
-          <w:szCs w:val="28"/>
-          <w:u w:val="single"/>
-        </w:rPr>
-        <w:t>có</w:t>
-      </w:r>
-      <w:proofErr w:type="spellEnd"/>
-      <w:r>
-        <w:rPr>
-          <w:rFonts w:ascii="Times New Roman" w:hAnsi="Times New Roman" w:cs="Times New Roman"/>
-          <w:sz w:val="28"/>
-          <w:szCs w:val="28"/>
-          <w:u w:val="single"/>
-        </w:rPr>
-        <w:t xml:space="preserve"> </w:t>
-      </w:r>
-      <w:proofErr w:type="spellStart"/>
-      <w:r>
-        <w:rPr>
-          <w:rFonts w:ascii="Times New Roman" w:hAnsi="Times New Roman" w:cs="Times New Roman"/>
-          <w:sz w:val="28"/>
-          <w:szCs w:val="28"/>
-          <w:u w:val="single"/>
-        </w:rPr>
-        <w:t>mã</w:t>
-      </w:r>
-      <w:proofErr w:type="spellEnd"/>
-      <w:r>
-        <w:rPr>
-          <w:rFonts w:ascii="Times New Roman" w:hAnsi="Times New Roman" w:cs="Times New Roman"/>
-          <w:sz w:val="28"/>
-          <w:szCs w:val="28"/>
-          <w:u w:val="single"/>
-        </w:rPr>
-        <w:t xml:space="preserve"> </w:t>
-      </w:r>
-      <w:proofErr w:type="spellStart"/>
-      <w:r>
-        <w:rPr>
-          <w:rFonts w:ascii="Times New Roman" w:hAnsi="Times New Roman" w:cs="Times New Roman"/>
-          <w:sz w:val="28"/>
-          <w:szCs w:val="28"/>
-          <w:u w:val="single"/>
-        </w:rPr>
-        <w:t>là</w:t>
-      </w:r>
-      <w:proofErr w:type="spellEnd"/>
-      <w:r>
-        <w:rPr>
-          <w:rFonts w:ascii="Times New Roman" w:hAnsi="Times New Roman" w:cs="Times New Roman"/>
-          <w:sz w:val="28"/>
-          <w:szCs w:val="28"/>
-          <w:u w:val="single"/>
-        </w:rPr>
-        <w:t xml:space="preserve"> </w:t>
-      </w:r>
-      <w:proofErr w:type="gramStart"/>
-      <w:r>
-        <w:rPr>
-          <w:rFonts w:ascii="Times New Roman" w:hAnsi="Times New Roman" w:cs="Times New Roman"/>
-          <w:sz w:val="28"/>
-          <w:szCs w:val="28"/>
-          <w:u w:val="single"/>
-        </w:rPr>
-        <w:t>9d65758</w:t>
-      </w:r>
-      <w:proofErr w:type="gramEnd"/>
-    </w:p>
-    <w:p>
-      <w:pPr>
-        <w:pStyle w:val="ListParagraph"/>
-        <w:ind w:left="1080"/>
-        <w:rPr>
-          <w:rFonts w:ascii="Times New Roman" w:hAnsi="Times New Roman" w:cs="Times New Roman"/>
-          <w:sz w:val="28"/>
-          <w:szCs w:val="28"/>
-          <w:u w:val="single"/>
-        </w:rPr>
-      </w:pPr>
-      <w:r>
-        <w:rPr>
-          <w:rFonts w:ascii="Times New Roman" w:hAnsi="Times New Roman" w:cs="Times New Roman"/>
-          <w:sz w:val="28"/>
-          <w:szCs w:val="28"/>
-          <w:u w:val="single"/>
-        </w:rPr>
-        <w:drawing>
-          <wp:inline distT="0" distB="0" distL="0" distR="0" wp14:anchorId="5B29BB88" wp14:editId="6B0C3987">
-            <wp:extent cx="4048690" cy="1467055"/>
-            <wp:effectExtent l="0" t="0" r="0" b="0"/>
-            <wp:docPr id="1839718785" name="Picture 1" descr="A screen shot of a computer program&#10;&#10;Description automatically generated"/>
-            <wp:cNvGraphicFramePr>
-              <a:graphicFrameLocks xmlns:a="http://schemas.openxmlformats.org/drawingml/2006/main" noChangeAspect="1"/>
-            </wp:cNvGraphicFramePr>
-            <a:graphic xmlns:a="http://schemas.openxmlformats.org/drawingml/2006/main">
-              <a:graphicData uri="http://schemas.openxmlformats.org/drawingml/2006/picture">
-                <pic:pic xmlns:pic="http://schemas.openxmlformats.org/drawingml/2006/picture">
-                  <pic:nvPicPr>
-                    <pic:cNvPr id="1839718785" name="Picture 1" descr="A screen shot of a computer program&#10;&#10;Description automatically generated"/>
-                    <pic:cNvPicPr/>
-                  </pic:nvPicPr>
-                  <pic:blipFill>
-                    <a:blip r:embed="rId6"/>
-                    <a:stretch>
-                      <a:fillRect/>
-                    </a:stretch>
-                  </pic:blipFill>
-                  <pic:spPr>
-                    <a:xfrm>
-                      <a:off x="0" y="0"/>
-                      <a:ext cx="4048690" cy="1467055"/>
-                    </a:xfrm>
-                    <a:prstGeom prst="rect">
-                      <a:avLst/>
-                    </a:prstGeom>
-                  </pic:spPr>
-                </pic:pic>
-              </a:graphicData>
-            </a:graphic>
-          </wp:inline>
-        </w:drawing>
-      </w:r>
-    </w:p>
-    <w:p>
-      <w:pPr>
-        <w:rPr>
-          <w:rFonts w:ascii="Times New Roman" w:hAnsi="Times New Roman" w:cs="Times New Roman"/>
-          <w:sz w:val="28"/>
-          <w:szCs w:val="28"/>
-          <w:u w:val="single"/>
-        </w:rPr>
-      </w:pPr>
-      <w:r>
-        <w:rPr>
-          <w:rFonts w:ascii="Times New Roman" w:hAnsi="Times New Roman" w:cs="Times New Roman"/>
-          <w:sz w:val="28"/>
-          <w:szCs w:val="28"/>
-          <w:u w:val="single"/>
-        </w:rPr>
-        <w:br w:type="page"/>
-      </w:r>
-    </w:p>
-    <w:p>
-      <w:pPr>
-        <w:pStyle w:val="ListParagraph"/>
-        <w:ind w:left="1080"/>
-        <w:rPr>
-          <w:rFonts w:ascii="Times New Roman" w:hAnsi="Times New Roman" w:cs="Times New Roman"/>
-          <w:sz w:val="28"/>
-          <w:szCs w:val="28"/>
-          <w:u w:val="single"/>
-        </w:rPr>
-      </w:pPr>
-    </w:p>
-    <w:p>
-      <w:pPr>
-        <w:pStyle w:val="ListParagraph"/>
-        <w:numPr>
-          <w:ilvl w:val="0"/>
-          <w:numId w:val="25"/>
-        </w:numPr>
-        <w:rPr>
-          <w:rFonts w:ascii="Times New Roman" w:hAnsi="Times New Roman" w:cs="Times New Roman"/>
-          <w:sz w:val="28"/>
-          <w:szCs w:val="28"/>
-          <w:u w:val="single"/>
-        </w:rPr>
-      </w:pPr>
-      <w:proofErr w:type="spellStart"/>
-      <w:r>
-        <w:rPr>
-          <w:rFonts w:ascii="Times New Roman" w:hAnsi="Times New Roman" w:cs="Times New Roman"/>
-          <w:sz w:val="28"/>
-          <w:szCs w:val="28"/>
-          <w:u w:val="single"/>
-        </w:rPr>
-        <w:t>Dùng</w:t>
-      </w:r>
-      <w:proofErr w:type="spellEnd"/>
-      <w:r>
-        <w:rPr>
-          <w:rFonts w:ascii="Times New Roman" w:hAnsi="Times New Roman" w:cs="Times New Roman"/>
-          <w:sz w:val="28"/>
-          <w:szCs w:val="28"/>
-          <w:u w:val="single"/>
-        </w:rPr>
-        <w:t xml:space="preserve"> </w:t>
-      </w:r>
-      <w:proofErr w:type="spellStart"/>
-      <w:r>
-        <w:rPr>
-          <w:rFonts w:ascii="Times New Roman" w:hAnsi="Times New Roman" w:cs="Times New Roman"/>
-          <w:sz w:val="28"/>
-          <w:szCs w:val="28"/>
-          <w:u w:val="single"/>
-        </w:rPr>
-        <w:t>lệnh</w:t>
-      </w:r>
-      <w:proofErr w:type="spellEnd"/>
-      <w:r>
-        <w:rPr>
-          <w:rFonts w:ascii="Times New Roman" w:hAnsi="Times New Roman" w:cs="Times New Roman"/>
-          <w:sz w:val="28"/>
-          <w:szCs w:val="28"/>
-          <w:u w:val="single"/>
-        </w:rPr>
-        <w:t xml:space="preserve"> git tag &lt;</w:t>
-      </w:r>
-      <w:proofErr w:type="spellStart"/>
-      <w:r>
-        <w:rPr>
-          <w:rFonts w:ascii="Times New Roman" w:hAnsi="Times New Roman" w:cs="Times New Roman"/>
-          <w:sz w:val="28"/>
-          <w:szCs w:val="28"/>
-          <w:u w:val="single"/>
-        </w:rPr>
-        <w:t>tên</w:t>
-      </w:r>
-      <w:proofErr w:type="spellEnd"/>
-      <w:r>
-        <w:rPr>
-          <w:rFonts w:ascii="Times New Roman" w:hAnsi="Times New Roman" w:cs="Times New Roman"/>
-          <w:sz w:val="28"/>
-          <w:szCs w:val="28"/>
-          <w:u w:val="single"/>
-        </w:rPr>
-        <w:t xml:space="preserve"> tag&gt; </w:t>
-      </w:r>
-      <w:proofErr w:type="spellStart"/>
-      <w:r>
-        <w:rPr>
-          <w:rFonts w:ascii="Times New Roman" w:hAnsi="Times New Roman" w:cs="Times New Roman"/>
-          <w:sz w:val="28"/>
-          <w:szCs w:val="28"/>
-          <w:u w:val="single"/>
-        </w:rPr>
-        <w:t>vd</w:t>
-      </w:r>
-      <w:proofErr w:type="spellEnd"/>
-      <w:r>
-        <w:rPr>
-          <w:rFonts w:ascii="Times New Roman" w:hAnsi="Times New Roman" w:cs="Times New Roman"/>
-          <w:sz w:val="28"/>
-          <w:szCs w:val="28"/>
-          <w:u w:val="single"/>
-        </w:rPr>
-        <w:t>: git tag Cau6</w:t>
-      </w:r>
-    </w:p>
-    <w:p>
-      <w:pPr>
-        <w:ind w:left="720"/>
-        <w:rPr>
-          <w:rFonts w:ascii="Times New Roman" w:hAnsi="Times New Roman" w:cs="Times New Roman"/>
-          <w:sz w:val="28"/>
-          <w:szCs w:val="28"/>
-          <w:u w:val="single"/>
-        </w:rPr>
-      </w:pPr>
-      <w:r>
-        <w:rPr>
-          <w:rFonts w:ascii="Times New Roman" w:hAnsi="Times New Roman" w:cs="Times New Roman"/>
-          <w:sz w:val="28"/>
-          <w:szCs w:val="28"/>
-          <w:u w:val="single"/>
-        </w:rPr>
-        <w:drawing>
-          <wp:inline distT="0" distB="0" distL="0" distR="0" wp14:anchorId="47BF0192" wp14:editId="05AC1615">
-            <wp:extent cx="4029637" cy="924054"/>
-            <wp:effectExtent l="0" t="0" r="0" b="9525"/>
-            <wp:docPr id="250287011" name="Picture 1" descr="A black background with white text&#10;&#10;Description automatically generated"/>
-            <wp:cNvGraphicFramePr>
-              <a:graphicFrameLocks xmlns:a="http://schemas.openxmlformats.org/drawingml/2006/main" noChangeAspect="1"/>
-            </wp:cNvGraphicFramePr>
-            <a:graphic xmlns:a="http://schemas.openxmlformats.org/drawingml/2006/main">
-              <a:graphicData uri="http://schemas.openxmlformats.org/drawingml/2006/picture">
-                <pic:pic xmlns:pic="http://schemas.openxmlformats.org/drawingml/2006/picture">
-                  <pic:nvPicPr>
-                    <pic:cNvPr id="250287011" name="Picture 1" descr="A black background with white text&#10;&#10;Description automatically generated"/>
-                    <pic:cNvPicPr/>
-                  </pic:nvPicPr>
-                  <pic:blipFill>
-                    <a:blip r:embed="rId7"/>
-                    <a:stretch>
-                      <a:fillRect/>
-                    </a:stretch>
-                  </pic:blipFill>
-                  <pic:spPr>
-                    <a:xfrm>
-                      <a:off x="0" y="0"/>
-                      <a:ext cx="4029637" cy="924054"/>
-                    </a:xfrm>
-                    <a:prstGeom prst="rect">
-                      <a:avLst/>
-                    </a:prstGeom>
-                  </pic:spPr>
-                </pic:pic>
-              </a:graphicData>
-            </a:graphic>
-          </wp:inline>
-        </w:drawing>
-      </w:r>
-    </w:p>
-    <w:p>
-      <w:pPr>
-        <w:pStyle w:val="ListParagraph"/>
-        <w:rPr>
-          <w:rFonts w:ascii="Times New Roman" w:hAnsi="Times New Roman" w:cs="Times New Roman"/>
-          <w:sz w:val="28"/>
-          <w:szCs w:val="28"/>
-          <w:u w:val="single"/>
-        </w:rPr>
-      </w:pPr>
     </w:p>
     <w:p>
       <w:pPr>
@@ -2226,70 +224,14 @@
           <w:szCs w:val="28"/>
         </w:rPr>
       </w:pPr>
-      <w:proofErr w:type="spellStart"/>
       <w:r>
         <w:rPr>
           <w:rFonts w:ascii="Times New Roman" w:hAnsi="Times New Roman" w:cs="Times New Roman"/>
           <w:sz w:val="28"/>
           <w:szCs w:val="28"/>
         </w:rPr>
-        <w:t>Phân</w:t>
+        <w:t>Phân biệt revert với reset</w:t>
       </w:r>
-      <w:proofErr w:type="spellEnd"/>
-      <w:r>
-        <w:rPr>
-          <w:rFonts w:ascii="Times New Roman" w:hAnsi="Times New Roman" w:cs="Times New Roman"/>
-          <w:sz w:val="28"/>
-          <w:szCs w:val="28"/>
-        </w:rPr>
-        <w:t xml:space="preserve"> </w:t>
-      </w:r>
-      <w:proofErr w:type="spellStart"/>
-      <w:r>
-        <w:rPr>
-          <w:rFonts w:ascii="Times New Roman" w:hAnsi="Times New Roman" w:cs="Times New Roman"/>
-          <w:sz w:val="28"/>
-          <w:szCs w:val="28"/>
-        </w:rPr>
-        <w:t>biệt</w:t>
-      </w:r>
-      <w:proofErr w:type="spellEnd"/>
-      <w:r>
-        <w:rPr>
-          <w:rFonts w:ascii="Times New Roman" w:hAnsi="Times New Roman" w:cs="Times New Roman"/>
-          <w:sz w:val="28"/>
-          <w:szCs w:val="28"/>
-        </w:rPr>
-        <w:t xml:space="preserve"> revert </w:t>
-      </w:r>
-      <w:proofErr w:type="spellStart"/>
-      <w:r>
-        <w:rPr>
-          <w:rFonts w:ascii="Times New Roman" w:hAnsi="Times New Roman" w:cs="Times New Roman"/>
-          <w:sz w:val="28"/>
-          <w:szCs w:val="28"/>
-        </w:rPr>
-        <w:t>với</w:t>
-      </w:r>
-      <w:proofErr w:type="spellEnd"/>
-      <w:r>
-        <w:rPr>
-          <w:rFonts w:ascii="Times New Roman" w:hAnsi="Times New Roman" w:cs="Times New Roman"/>
-          <w:sz w:val="28"/>
-          <w:szCs w:val="28"/>
-        </w:rPr>
-        <w:t xml:space="preserve"> </w:t>
-      </w:r>
-      <w:proofErr w:type="gramStart"/>
-      <w:r>
-        <w:rPr>
-          <w:rFonts w:ascii="Times New Roman" w:hAnsi="Times New Roman" w:cs="Times New Roman"/>
-          <w:sz w:val="28"/>
-          <w:szCs w:val="28"/>
-        </w:rPr>
-        <w:t>reset</w:t>
-      </w:r>
-      <w:proofErr w:type="gramEnd"/>
     </w:p>
     <w:p>
       <w:pPr>
@@ -2304,77 +246,13 @@
           <w:szCs w:val="28"/>
         </w:rPr>
       </w:pPr>
-      <w:proofErr w:type="spellStart"/>
       <w:r>
         <w:rPr>
           <w:rFonts w:ascii="Times New Roman" w:hAnsi="Times New Roman" w:cs="Times New Roman"/>
           <w:sz w:val="28"/>
           <w:szCs w:val="28"/>
         </w:rPr>
-        <w:t>Hướng</w:t>
-      </w:r>
-      <w:proofErr w:type="spellEnd"/>
-      <w:r>
-        <w:rPr>
-          <w:rFonts w:ascii="Times New Roman" w:hAnsi="Times New Roman" w:cs="Times New Roman"/>
-          <w:sz w:val="28"/>
-          <w:szCs w:val="28"/>
-        </w:rPr>
-        <w:t xml:space="preserve"> </w:t>
-      </w:r>
-      <w:proofErr w:type="spellStart"/>
-      <w:r>
-        <w:rPr>
-          <w:rFonts w:ascii="Times New Roman" w:hAnsi="Times New Roman" w:cs="Times New Roman"/>
-          <w:sz w:val="28"/>
-          <w:szCs w:val="28"/>
-        </w:rPr>
-        <w:t>dẫn</w:t>
-      </w:r>
-      <w:proofErr w:type="spellEnd"/>
-      <w:r>
-        <w:rPr>
-          <w:rFonts w:ascii="Times New Roman" w:hAnsi="Times New Roman" w:cs="Times New Roman"/>
-          <w:sz w:val="28"/>
-          <w:szCs w:val="28"/>
-        </w:rPr>
-        <w:t xml:space="preserve"> </w:t>
-      </w:r>
-      <w:proofErr w:type="spellStart"/>
-      <w:r>
-        <w:rPr>
-          <w:rFonts w:ascii="Times New Roman" w:hAnsi="Times New Roman" w:cs="Times New Roman"/>
-          <w:sz w:val="28"/>
-          <w:szCs w:val="28"/>
-        </w:rPr>
-        <w:t>sử</w:t>
-      </w:r>
-      <w:proofErr w:type="spellEnd"/>
-      <w:r>
-        <w:rPr>
-          <w:rFonts w:ascii="Times New Roman" w:hAnsi="Times New Roman" w:cs="Times New Roman"/>
-          <w:sz w:val="28"/>
-          <w:szCs w:val="28"/>
-        </w:rPr>
-        <w:t xml:space="preserve"> </w:t>
-      </w:r>
-      <w:proofErr w:type="spellStart"/>
-      <w:r>
-        <w:rPr>
-          <w:rFonts w:ascii="Times New Roman" w:hAnsi="Times New Roman" w:cs="Times New Roman"/>
-          <w:sz w:val="28"/>
-          <w:szCs w:val="28"/>
-        </w:rPr>
-        <w:t>dụng</w:t>
-      </w:r>
-      <w:proofErr w:type="spellEnd"/>
-      <w:r>
-        <w:rPr>
-          <w:rFonts w:ascii="Times New Roman" w:hAnsi="Times New Roman" w:cs="Times New Roman"/>
-          <w:sz w:val="28"/>
-          <w:szCs w:val="28"/>
-        </w:rPr>
-        <w:t xml:space="preserve"> git diff</w:t>
+        <w:t>Hướng dẫn sử dụng git diff</w:t>
       </w:r>
     </w:p>
     <w:sectPr>
@@ -3376,118 +1254,6 @@
     </w:lvl>
   </w:abstractNum>
   <w:abstractNum w:abstractNumId="8" w15:restartNumberingAfterBreak="0">
-    <w:nsid w:val="137945F3"/>
-    <w:multiLevelType w:val="hybridMultilevel"/>
-    <w:tmpl w:val="E1D0AA26"/>
-    <w:lvl w:ilvl="0" w:tplc="984E6B90">
-      <w:numFmt w:val="bullet"/>
-      <w:lvlText w:val="-"/>
-      <w:lvlJc w:val="left"/>
-      <w:pPr>
-        <w:ind w:left="1080" w:hanging="360"/>
-      </w:pPr>
-      <w:rPr>
-        <w:rFonts w:ascii="Times New Roman" w:eastAsiaTheme="minorHAnsi" w:hAnsi="Times New Roman" w:cs="Times New Roman" w:hint="default"/>
-      </w:rPr>
-    </w:lvl>
-    <w:lvl w:ilvl="1" w:tplc="04090003" w:tentative="1">
-      <w:start w:val="1"/>
-      <w:numFmt w:val="bullet"/>
-      <w:lvlText w:val="o"/>
-      <w:lvlJc w:val="left"/>
-      <w:pPr>
-        <w:ind w:left="1800" w:hanging="360"/>
-      </w:pPr>
-      <w:rPr>
-        <w:rFonts w:ascii="Courier New" w:hAnsi="Courier New" w:cs="Courier New" w:hint="default"/>
-      </w:rPr>
-    </w:lvl>
-    <w:lvl w:ilvl="2" w:tplc="04090005" w:tentative="1">
-      <w:start w:val="1"/>
-      <w:numFmt w:val="bullet"/>
-      <w:lvlText w:val=""/>
-      <w:lvlJc w:val="left"/>
-      <w:pPr>
-        <w:ind w:left="2520" w:hanging="360"/>
-      </w:pPr>
-      <w:rPr>
-        <w:rFonts w:ascii="Wingdings" w:hAnsi="Wingdings" w:hint="default"/>
-      </w:rPr>
-    </w:lvl>
-    <w:lvl w:ilvl="3" w:tplc="04090001" w:tentative="1">
-      <w:start w:val="1"/>
-      <w:numFmt w:val="bullet"/>
-      <w:lvlText w:val=""/>
-      <w:lvlJc w:val="left"/>
-      <w:pPr>
-        <w:ind w:left="3240" w:hanging="360"/>
-      </w:pPr>
-      <w:rPr>
-        <w:rFonts w:ascii="Symbol" w:hAnsi="Symbol" w:hint="default"/>
-      </w:rPr>
-    </w:lvl>
-    <w:lvl w:ilvl="4" w:tplc="04090003" w:tentative="1">
-      <w:start w:val="1"/>
-      <w:numFmt w:val="bullet"/>
-      <w:lvlText w:val="o"/>
-      <w:lvlJc w:val="left"/>
-      <w:pPr>
-        <w:ind w:left="3960" w:hanging="360"/>
-      </w:pPr>
-      <w:rPr>
-        <w:rFonts w:ascii="Courier New" w:hAnsi="Courier New" w:cs="Courier New" w:hint="default"/>
-      </w:rPr>
-    </w:lvl>
-    <w:lvl w:ilvl="5" w:tplc="04090005" w:tentative="1">
-      <w:start w:val="1"/>
-      <w:numFmt w:val="bullet"/>
-      <w:lvlText w:val=""/>
-      <w:lvlJc w:val="left"/>
-      <w:pPr>
-        <w:ind w:left="4680" w:hanging="360"/>
-      </w:pPr>
-      <w:rPr>
-        <w:rFonts w:ascii="Wingdings" w:hAnsi="Wingdings" w:hint="default"/>
-      </w:rPr>
-    </w:lvl>
-    <w:lvl w:ilvl="6" w:tplc="04090001" w:tentative="1">
-      <w:start w:val="1"/>
-      <w:numFmt w:val="bullet"/>
-      <w:lvlText w:val=""/>
-      <w:lvlJc w:val="left"/>
-      <w:pPr>
-        <w:ind w:left="5400" w:hanging="360"/>
-      </w:pPr>
-      <w:rPr>
-        <w:rFonts w:ascii="Symbol" w:hAnsi="Symbol" w:hint="default"/>
-      </w:rPr>
-    </w:lvl>
-    <w:lvl w:ilvl="7" w:tplc="04090003" w:tentative="1">
-      <w:start w:val="1"/>
-      <w:numFmt w:val="bullet"/>
-      <w:lvlText w:val="o"/>
-      <w:lvlJc w:val="left"/>
-      <w:pPr>
-        <w:ind w:left="6120" w:hanging="360"/>
-      </w:pPr>
-      <w:rPr>
-        <w:rFonts w:ascii="Courier New" w:hAnsi="Courier New" w:cs="Courier New" w:hint="default"/>
-      </w:rPr>
-    </w:lvl>
-    <w:lvl w:ilvl="8" w:tplc="04090005" w:tentative="1">
-      <w:start w:val="1"/>
-      <w:numFmt w:val="bullet"/>
-      <w:lvlText w:val=""/>
-      <w:lvlJc w:val="left"/>
-      <w:pPr>
-        <w:ind w:left="6840" w:hanging="360"/>
-      </w:pPr>
-      <w:rPr>
-        <w:rFonts w:ascii="Wingdings" w:hAnsi="Wingdings" w:hint="default"/>
-      </w:rPr>
-    </w:lvl>
-  </w:abstractNum>
-  <w:abstractNum w:abstractNumId="9" w15:restartNumberingAfterBreak="0">
     <w:nsid w:val="1B5D714A"/>
     <w:multiLevelType w:val="hybridMultilevel"/>
     <w:tmpl w:val="91ECA1B6"/>
@@ -3576,7 +1342,7 @@
       </w:pPr>
     </w:lvl>
   </w:abstractNum>
-  <w:abstractNum w:abstractNumId="10" w15:restartNumberingAfterBreak="0">
+  <w:abstractNum w:abstractNumId="9" w15:restartNumberingAfterBreak="0">
     <w:nsid w:val="20687943"/>
     <w:multiLevelType w:val="multilevel"/>
     <w:tmpl w:val="940AB698"/>
@@ -3725,7 +1491,7 @@
       </w:rPr>
     </w:lvl>
   </w:abstractNum>
-  <w:abstractNum w:abstractNumId="11" w15:restartNumberingAfterBreak="0">
+  <w:abstractNum w:abstractNumId="10" w15:restartNumberingAfterBreak="0">
     <w:nsid w:val="25660680"/>
     <w:multiLevelType w:val="hybridMultilevel"/>
     <w:tmpl w:val="CC8828A6"/>
@@ -3837,7 +1603,7 @@
       </w:rPr>
     </w:lvl>
   </w:abstractNum>
-  <w:abstractNum w:abstractNumId="12" w15:restartNumberingAfterBreak="0">
+  <w:abstractNum w:abstractNumId="11" w15:restartNumberingAfterBreak="0">
     <w:nsid w:val="27EC41AC"/>
     <w:multiLevelType w:val="hybridMultilevel"/>
     <w:tmpl w:val="257A085C"/>
@@ -3949,7 +1715,7 @@
       </w:rPr>
     </w:lvl>
   </w:abstractNum>
-  <w:abstractNum w:abstractNumId="13" w15:restartNumberingAfterBreak="0">
+  <w:abstractNum w:abstractNumId="12" w15:restartNumberingAfterBreak="0">
     <w:nsid w:val="301D7DCA"/>
     <w:multiLevelType w:val="hybridMultilevel"/>
     <w:tmpl w:val="8B1427C6"/>
@@ -4061,7 +1827,7 @@
       </w:rPr>
     </w:lvl>
   </w:abstractNum>
-  <w:abstractNum w:abstractNumId="14" w15:restartNumberingAfterBreak="0">
+  <w:abstractNum w:abstractNumId="13" w15:restartNumberingAfterBreak="0">
     <w:nsid w:val="37767074"/>
     <w:multiLevelType w:val="hybridMultilevel"/>
     <w:tmpl w:val="A5C28C00"/>
@@ -4174,7 +1940,7 @@
       </w:rPr>
     </w:lvl>
   </w:abstractNum>
-  <w:abstractNum w:abstractNumId="15" w15:restartNumberingAfterBreak="0">
+  <w:abstractNum w:abstractNumId="14" w15:restartNumberingAfterBreak="0">
     <w:nsid w:val="40110DC8"/>
     <w:multiLevelType w:val="hybridMultilevel"/>
     <w:tmpl w:val="1098EC44"/>
@@ -4287,7 +2053,7 @@
       </w:rPr>
     </w:lvl>
   </w:abstractNum>
-  <w:abstractNum w:abstractNumId="16" w15:restartNumberingAfterBreak="0">
+  <w:abstractNum w:abstractNumId="15" w15:restartNumberingAfterBreak="0">
     <w:nsid w:val="427A7476"/>
     <w:multiLevelType w:val="hybridMultilevel"/>
     <w:tmpl w:val="BCBC1A54"/>
@@ -4400,7 +2166,7 @@
       </w:rPr>
     </w:lvl>
   </w:abstractNum>
-  <w:abstractNum w:abstractNumId="17" w15:restartNumberingAfterBreak="0">
+  <w:abstractNum w:abstractNumId="16" w15:restartNumberingAfterBreak="0">
     <w:nsid w:val="44B10E2C"/>
     <w:multiLevelType w:val="hybridMultilevel"/>
     <w:tmpl w:val="91DC5200"/>
@@ -4512,7 +2278,7 @@
       </w:rPr>
     </w:lvl>
   </w:abstractNum>
-  <w:abstractNum w:abstractNumId="18" w15:restartNumberingAfterBreak="0">
+  <w:abstractNum w:abstractNumId="17" w15:restartNumberingAfterBreak="0">
     <w:nsid w:val="47717CF3"/>
     <w:multiLevelType w:val="hybridMultilevel"/>
     <w:tmpl w:val="AD38C92C"/>
@@ -4625,7 +2391,7 @@
       </w:rPr>
     </w:lvl>
   </w:abstractNum>
-  <w:abstractNum w:abstractNumId="19" w15:restartNumberingAfterBreak="0">
+  <w:abstractNum w:abstractNumId="18" w15:restartNumberingAfterBreak="0">
     <w:nsid w:val="4E45610D"/>
     <w:multiLevelType w:val="hybridMultilevel"/>
     <w:tmpl w:val="8AFC5FEE"/>
@@ -4737,7 +2503,7 @@
       </w:rPr>
     </w:lvl>
   </w:abstractNum>
-  <w:abstractNum w:abstractNumId="20" w15:restartNumberingAfterBreak="0">
+  <w:abstractNum w:abstractNumId="19" w15:restartNumberingAfterBreak="0">
     <w:nsid w:val="581026CC"/>
     <w:multiLevelType w:val="hybridMultilevel"/>
     <w:tmpl w:val="8B62AF4C"/>
@@ -4850,7 +2616,7 @@
       </w:rPr>
     </w:lvl>
   </w:abstractNum>
-  <w:abstractNum w:abstractNumId="21" w15:restartNumberingAfterBreak="0">
+  <w:abstractNum w:abstractNumId="20" w15:restartNumberingAfterBreak="0">
     <w:nsid w:val="5E0F2477"/>
     <w:multiLevelType w:val="multilevel"/>
     <w:tmpl w:val="221E55E4"/>
@@ -4999,7 +2765,7 @@
       </w:rPr>
     </w:lvl>
   </w:abstractNum>
-  <w:abstractNum w:abstractNumId="22" w15:restartNumberingAfterBreak="0">
+  <w:abstractNum w:abstractNumId="21" w15:restartNumberingAfterBreak="0">
     <w:nsid w:val="7A57358E"/>
     <w:multiLevelType w:val="multilevel"/>
     <w:tmpl w:val="B330DE74"/>
@@ -5148,7 +2914,7 @@
       </w:rPr>
     </w:lvl>
   </w:abstractNum>
-  <w:abstractNum w:abstractNumId="23" w15:restartNumberingAfterBreak="0">
+  <w:abstractNum w:abstractNumId="22" w15:restartNumberingAfterBreak="0">
     <w:nsid w:val="7C371BCA"/>
     <w:multiLevelType w:val="hybridMultilevel"/>
     <w:tmpl w:val="7898EE18"/>
@@ -5261,7 +3027,7 @@
       </w:rPr>
     </w:lvl>
   </w:abstractNum>
-  <w:abstractNum w:abstractNumId="24" w15:restartNumberingAfterBreak="0">
+  <w:abstractNum w:abstractNumId="23" w15:restartNumberingAfterBreak="0">
     <w:nsid w:val="7D7970EB"/>
     <w:multiLevelType w:val="hybridMultilevel"/>
     <w:tmpl w:val="F83EF5DC"/>
@@ -5351,34 +3117,34 @@
     </w:lvl>
   </w:abstractNum>
   <w:num w:numId="1" w16cid:durableId="1494180743">
-    <w:abstractNumId w:val="24"/>
+    <w:abstractNumId w:val="23"/>
   </w:num>
   <w:num w:numId="2" w16cid:durableId="869535664">
     <w:abstractNumId w:val="0"/>
   </w:num>
   <w:num w:numId="3" w16cid:durableId="569847942">
-    <w:abstractNumId w:val="14"/>
+    <w:abstractNumId w:val="13"/>
   </w:num>
   <w:num w:numId="4" w16cid:durableId="658774072">
-    <w:abstractNumId w:val="18"/>
+    <w:abstractNumId w:val="17"/>
   </w:num>
   <w:num w:numId="5" w16cid:durableId="422454624">
-    <w:abstractNumId w:val="16"/>
+    <w:abstractNumId w:val="15"/>
   </w:num>
   <w:num w:numId="6" w16cid:durableId="145514290">
     <w:abstractNumId w:val="5"/>
   </w:num>
   <w:num w:numId="7" w16cid:durableId="1492022925">
-    <w:abstractNumId w:val="21"/>
+    <w:abstractNumId w:val="20"/>
   </w:num>
   <w:num w:numId="8" w16cid:durableId="92475682">
     <w:abstractNumId w:val="6"/>
   </w:num>
   <w:num w:numId="9" w16cid:durableId="1428427106">
-    <w:abstractNumId w:val="22"/>
+    <w:abstractNumId w:val="21"/>
   </w:num>
   <w:num w:numId="10" w16cid:durableId="1961060685">
-    <w:abstractNumId w:val="23"/>
+    <w:abstractNumId w:val="22"/>
   </w:num>
   <w:num w:numId="11" w16cid:durableId="201019243">
     <w:abstractNumId w:val="2"/>
@@ -5387,25 +3153,25 @@
     <w:abstractNumId w:val="4"/>
   </w:num>
   <w:num w:numId="13" w16cid:durableId="1521580962">
-    <w:abstractNumId w:val="20"/>
+    <w:abstractNumId w:val="19"/>
   </w:num>
   <w:num w:numId="14" w16cid:durableId="478110281">
-    <w:abstractNumId w:val="10"/>
+    <w:abstractNumId w:val="9"/>
   </w:num>
   <w:num w:numId="15" w16cid:durableId="1540819371">
     <w:abstractNumId w:val="1"/>
   </w:num>
   <w:num w:numId="16" w16cid:durableId="548032682">
-    <w:abstractNumId w:val="19"/>
+    <w:abstractNumId w:val="18"/>
   </w:num>
   <w:num w:numId="17" w16cid:durableId="1148789640">
-    <w:abstractNumId w:val="12"/>
+    <w:abstractNumId w:val="11"/>
   </w:num>
   <w:num w:numId="18" w16cid:durableId="1911848353">
-    <w:abstractNumId w:val="11"/>
+    <w:abstractNumId w:val="10"/>
   </w:num>
   <w:num w:numId="19" w16cid:durableId="1719208326">
-    <w:abstractNumId w:val="15"/>
+    <w:abstractNumId w:val="14"/>
   </w:num>
   <w:num w:numId="20" w16cid:durableId="785392966">
     <w:abstractNumId w:val="7"/>
@@ -5414,16 +3180,13 @@
     <w:abstractNumId w:val="3"/>
   </w:num>
   <w:num w:numId="22" w16cid:durableId="1908225835">
-    <w:abstractNumId w:val="9"/>
+    <w:abstractNumId w:val="8"/>
   </w:num>
   <w:num w:numId="23" w16cid:durableId="1493720001">
-    <w:abstractNumId w:val="17"/>
+    <w:abstractNumId w:val="16"/>
   </w:num>
   <w:num w:numId="24" w16cid:durableId="1073626782">
-    <w:abstractNumId w:val="13"/>
-  </w:num>
-  <w:num w:numId="25" w16cid:durableId="1486359320">
-    <w:abstractNumId w:val="8"/>
+    <w:abstractNumId w:val="12"/>
   </w:num>
 </w:numbering>
 </file>

</xml_diff>